<commit_message>
fix: padronizar fontes e atualizar documentos das propostas
</commit_message>
<xml_diff>
--- a/backend/models/comercial/Proposta técnica.docx
+++ b/backend/models/comercial/Proposta técnica.docx
@@ -2288,8 +2288,8 @@
         <w:rPr>
           <w:rFonts w:ascii="Arial" w:hAnsi="Arial" w:cs="Arial"/>
           <w:b w:val="true"/>
-          <w:sz w:val="24"/>
-          <w:szCs w:val="24"/>
+          <w:sz w:val="20"/>
+          <w:szCs w:val="20"/>
           <w:bCs w:val="true"/>
         </w:rPr>
       </w:pPr>
@@ -2299,8 +2299,8 @@
           <w:rFonts w:ascii="Arial" w:hAnsi="Arial" w:cs="Arial"/>
           <w:b w:val="true"/>
           <w:bCs w:val="true"/>
-          <w:sz w:val="24"/>
-          <w:szCs w:val="24"/>
+          <w:sz w:val="20"/>
+          <w:szCs w:val="20"/>
         </w:rPr>
         <w:lastRenderedPageBreak/>
         <w:t>Filtrovali é a escolha certa</w:t>
@@ -2310,8 +2310,8 @@
           <w:rFonts w:ascii="Arial" w:hAnsi="Arial" w:cs="Arial"/>
           <w:b w:val="true"/>
           <w:bCs w:val="true"/>
-          <w:sz w:val="24"/>
-          <w:szCs w:val="24"/>
+          <w:sz w:val="20"/>
+          <w:szCs w:val="20"/>
         </w:rPr>
         <w:t xml:space="preserve"> para a sua obra</w:t>
       </w:r>
@@ -2326,8 +2326,8 @@
         <w:ind w:firstLine="708"/>
         <w:rPr>
           <w:rFonts w:ascii="Arial" w:hAnsi="Arial" w:cs="Arial"/>
-          <w:sz w:val="24"/>
-          <w:szCs w:val="24"/>
+          <w:sz w:val="20"/>
+          <w:szCs w:val="20"/>
         </w:rPr>
       </w:pPr>
     </w:p>
@@ -2340,8 +2340,8 @@
         <w:ind w:firstLine="708"/>
         <w:rPr>
           <w:rFonts w:ascii="Arial" w:hAnsi="Arial" w:cs="Arial"/>
-          <w:sz w:val="24"/>
-          <w:szCs w:val="24"/>
+          <w:sz w:val="20"/>
+          <w:szCs w:val="20"/>
         </w:rPr>
       </w:pPr>
       <w:r>
@@ -2350,8 +2350,8 @@
           <w:b/>
           <w:bCs/>
           <w:noProof/>
-          <w:sz w:val="24"/>
-          <w:szCs w:val="24"/>
+          <w:sz w:val="20"/>
+          <w:szCs w:val="20"/>
         </w:rPr>
         <mc:AlternateContent>
           <mc:Choice Requires="wps">
@@ -2402,6 +2402,8 @@
                               <w:rPr>
                                 <w:b/>
                                 <w:bCs/>
+                                <w:sz w:val="20"/>
+                                <w:szCs w:val="20"/>
                               </w:rPr>
                             </w:pPr>
                             <w:r>
@@ -2409,8 +2411,8 @@
                                 <w:b/>
                                 <w:bCs/>
                                 <w:rFonts w:ascii="Arial" w:hAnsi="Arial" w:cs="Arial"/>
-                                <w:sz w:val="24"/>
-                                <w:szCs w:val="24"/>
+                                <w:sz w:val="20"/>
+                                <w:szCs w:val="20"/>
                               </w:rPr>
                               <w:t>Equipamentos modernos e revisados</w:t>
                             </w:r>
@@ -2444,6 +2446,8 @@
                         <w:rPr>
                           <w:b/>
                           <w:bCs/>
+                          <w:sz w:val="20"/>
+                          <w:szCs w:val="20"/>
                         </w:rPr>
                       </w:pPr>
                       <w:r>
@@ -2451,8 +2455,8 @@
                           <w:b/>
                           <w:bCs/>
                           <w:rFonts w:ascii="Arial" w:hAnsi="Arial" w:cs="Arial"/>
-                          <w:sz w:val="24"/>
-                          <w:szCs w:val="24"/>
+                          <w:sz w:val="20"/>
+                          <w:szCs w:val="20"/>
                         </w:rPr>
                         <w:t>Equipamentos modernos e revisados</w:t>
                       </w:r>
@@ -2470,8 +2474,8 @@
           <w:b/>
           <w:bCs/>
           <w:noProof/>
-          <w:sz w:val="24"/>
-          <w:szCs w:val="24"/>
+          <w:sz w:val="20"/>
+          <w:szCs w:val="20"/>
         </w:rPr>
         <mc:AlternateContent>
           <mc:Choice Requires="wps">
@@ -2522,6 +2526,8 @@
                               <w:rPr>
                                 <w:b/>
                                 <w:bCs/>
+                                <w:sz w:val="20"/>
+                                <w:szCs w:val="20"/>
                               </w:rPr>
                             </w:pPr>
                             <w:r>
@@ -2529,8 +2535,8 @@
                                 <w:b/>
                                 <w:bCs/>
                                 <w:rFonts w:ascii="Arial" w:hAnsi="Arial" w:cs="Arial"/>
-                                <w:sz w:val="24"/>
-                                <w:szCs w:val="24"/>
+                                <w:sz w:val="20"/>
+                                <w:szCs w:val="20"/>
                               </w:rPr>
                               <w:t>Equipe com +10 certificações técnicas (</w:t>
                             </w:r>
@@ -2540,8 +2546,8 @@
                                 <w:b/>
                                 <w:bCs/>
                                 <w:rFonts w:ascii="Arial" w:hAnsi="Arial" w:cs="Arial"/>
-                                <w:sz w:val="24"/>
-                                <w:szCs w:val="24"/>
+                                <w:sz w:val="20"/>
+                                <w:szCs w:val="20"/>
                               </w:rPr>
                               <w:t>NRs</w:t>
                             </w:r>
@@ -2551,8 +2557,8 @@
                                 <w:b/>
                                 <w:bCs/>
                                 <w:rFonts w:ascii="Arial" w:hAnsi="Arial" w:cs="Arial"/>
-                                <w:sz w:val="24"/>
-                                <w:szCs w:val="24"/>
+                                <w:sz w:val="20"/>
+                                <w:szCs w:val="20"/>
                               </w:rPr>
                               <w:t>)</w:t>
                             </w:r>
@@ -2586,6 +2592,8 @@
                         <w:rPr>
                           <w:b/>
                           <w:bCs/>
+                          <w:sz w:val="20"/>
+                          <w:szCs w:val="20"/>
                         </w:rPr>
                       </w:pPr>
                       <w:r>
@@ -2593,8 +2601,8 @@
                           <w:b/>
                           <w:bCs/>
                           <w:rFonts w:ascii="Arial" w:hAnsi="Arial" w:cs="Arial"/>
-                          <w:sz w:val="24"/>
-                          <w:szCs w:val="24"/>
+                          <w:sz w:val="20"/>
+                          <w:szCs w:val="20"/>
                         </w:rPr>
                         <w:t>Equipe com +10 certificações técnicas (</w:t>
                       </w:r>
@@ -2604,8 +2612,8 @@
                           <w:b/>
                           <w:bCs/>
                           <w:rFonts w:ascii="Arial" w:hAnsi="Arial" w:cs="Arial"/>
-                          <w:sz w:val="24"/>
-                          <w:szCs w:val="24"/>
+                          <w:sz w:val="20"/>
+                          <w:szCs w:val="20"/>
                         </w:rPr>
                         <w:t>NRs</w:t>
                       </w:r>
@@ -2615,8 +2623,8 @@
                           <w:b/>
                           <w:bCs/>
                           <w:rFonts w:ascii="Arial" w:hAnsi="Arial" w:cs="Arial"/>
-                          <w:sz w:val="24"/>
-                          <w:szCs w:val="24"/>
+                          <w:sz w:val="20"/>
+                          <w:szCs w:val="20"/>
                         </w:rPr>
                         <w:t>)</w:t>
                       </w:r>
@@ -2634,8 +2642,8 @@
           <w:b/>
           <w:bCs/>
           <w:noProof/>
-          <w:sz w:val="24"/>
-          <w:szCs w:val="24"/>
+          <w:sz w:val="20"/>
+          <w:szCs w:val="20"/>
         </w:rPr>
         <mc:AlternateContent>
           <mc:Choice Requires="wps">
@@ -2686,6 +2694,8 @@
                               <w:rPr>
                                 <w:b/>
                                 <w:bCs/>
+                                <w:sz w:val="20"/>
+                                <w:szCs w:val="20"/>
                               </w:rPr>
                             </w:pPr>
                             <w:r>
@@ -2693,8 +2703,8 @@
                                 <w:b/>
                                 <w:bCs/>
                                 <w:rFonts w:ascii="Arial" w:hAnsi="Arial" w:cs="Arial"/>
-                                <w:sz w:val="24"/>
-                                <w:szCs w:val="24"/>
+                                <w:sz w:val="20"/>
+                                <w:szCs w:val="20"/>
                               </w:rPr>
                               <w:t>Obras em 22 estados brasileiros</w:t>
                             </w:r>
@@ -2728,6 +2738,8 @@
                         <w:rPr>
                           <w:b/>
                           <w:bCs/>
+                          <w:sz w:val="20"/>
+                          <w:szCs w:val="20"/>
                         </w:rPr>
                       </w:pPr>
                       <w:r>
@@ -2735,8 +2747,8 @@
                           <w:b/>
                           <w:bCs/>
                           <w:rFonts w:ascii="Arial" w:hAnsi="Arial" w:cs="Arial"/>
-                          <w:sz w:val="24"/>
-                          <w:szCs w:val="24"/>
+                          <w:sz w:val="20"/>
+                          <w:szCs w:val="20"/>
                         </w:rPr>
                         <w:t>Obras em 22 estados brasileiros</w:t>
                       </w:r>
@@ -2754,8 +2766,8 @@
           <w:b/>
           <w:bCs/>
           <w:noProof/>
-          <w:sz w:val="24"/>
-          <w:szCs w:val="24"/>
+          <w:sz w:val="20"/>
+          <w:szCs w:val="20"/>
         </w:rPr>
         <mc:AlternateContent>
           <mc:Choice Requires="wps">
@@ -2806,6 +2818,8 @@
                               <w:rPr>
                                 <w:b/>
                                 <w:bCs/>
+                                <w:sz w:val="20"/>
+                                <w:szCs w:val="20"/>
                               </w:rPr>
                             </w:pPr>
                             <w:r>
@@ -2813,8 +2827,8 @@
                                 <w:b/>
                                 <w:bCs/>
                                 <w:rFonts w:ascii="Arial" w:hAnsi="Arial" w:cs="Arial"/>
-                                <w:sz w:val="24"/>
-                                <w:szCs w:val="24"/>
+                                <w:sz w:val="20"/>
+                                <w:szCs w:val="20"/>
                               </w:rPr>
                               <w:t>+850 projetos entregues com excelência</w:t>
                             </w:r>
@@ -2848,6 +2862,8 @@
                         <w:rPr>
                           <w:b/>
                           <w:bCs/>
+                          <w:sz w:val="20"/>
+                          <w:szCs w:val="20"/>
                         </w:rPr>
                       </w:pPr>
                       <w:r>
@@ -2855,8 +2871,8 @@
                           <w:b/>
                           <w:bCs/>
                           <w:rFonts w:ascii="Arial" w:hAnsi="Arial" w:cs="Arial"/>
-                          <w:sz w:val="24"/>
-                          <w:szCs w:val="24"/>
+                          <w:sz w:val="20"/>
+                          <w:szCs w:val="20"/>
                         </w:rPr>
                         <w:t>+850 projetos entregues com excelência</w:t>
                       </w:r>
@@ -2871,64 +2887,64 @@
       <w:r>
         <w:rPr>
           <w:rFonts w:ascii="Arial" w:hAnsi="Arial" w:cs="Arial"/>
-          <w:sz w:val="24"/>
-          <w:szCs w:val="24"/>
+          <w:sz w:val="20"/>
+          <w:szCs w:val="20"/>
         </w:rPr>
         <w:t xml:space="preserve">São </w:t>
       </w:r>
       <w:r>
         <w:rPr>
           <w:rFonts w:ascii="Arial" w:hAnsi="Arial" w:cs="Arial"/>
-          <w:sz w:val="24"/>
-          <w:szCs w:val="24"/>
+          <w:sz w:val="20"/>
+          <w:szCs w:val="20"/>
         </w:rPr>
         <w:t>2</w:t>
       </w:r>
       <w:r>
         <w:rPr>
           <w:rFonts w:ascii="Arial" w:hAnsi="Arial" w:cs="Arial"/>
-          <w:sz w:val="24"/>
-          <w:szCs w:val="24"/>
+          <w:sz w:val="20"/>
+          <w:szCs w:val="20"/>
         </w:rPr>
         <w:t>1</w:t>
       </w:r>
       <w:r>
         <w:rPr>
           <w:rFonts w:ascii="Arial" w:hAnsi="Arial" w:cs="Arial"/>
-          <w:sz w:val="24"/>
-          <w:szCs w:val="24"/>
+          <w:sz w:val="20"/>
+          <w:szCs w:val="20"/>
         </w:rPr>
         <w:t xml:space="preserve"> anos de história </w:t>
       </w:r>
       <w:r>
         <w:rPr>
           <w:rFonts w:ascii="Arial" w:hAnsi="Arial" w:cs="Arial"/>
-          <w:sz w:val="24"/>
-          <w:szCs w:val="24"/>
+          <w:sz w:val="20"/>
+          <w:szCs w:val="20"/>
         </w:rPr>
         <w:t>e entregas de</w:t>
       </w:r>
       <w:r>
         <w:rPr>
           <w:rFonts w:ascii="Arial" w:hAnsi="Arial" w:cs="Arial"/>
-          <w:sz w:val="24"/>
-          <w:szCs w:val="24"/>
+          <w:sz w:val="20"/>
+          <w:szCs w:val="20"/>
         </w:rPr>
         <w:t xml:space="preserve"> soluções </w:t>
       </w:r>
       <w:r>
         <w:rPr>
           <w:rFonts w:ascii="Arial" w:hAnsi="Arial" w:cs="Arial"/>
-          <w:sz w:val="24"/>
-          <w:szCs w:val="24"/>
+          <w:sz w:val="20"/>
+          <w:szCs w:val="20"/>
         </w:rPr>
         <w:t>industriais, com:</w:t>
       </w:r>
       <w:r>
         <w:rPr>
           <w:rFonts w:ascii="Arial" w:hAnsi="Arial" w:cs="Arial"/>
-          <w:sz w:val="24"/>
-          <w:szCs w:val="24"/>
+          <w:sz w:val="20"/>
+          <w:szCs w:val="20"/>
         </w:rPr>
         <w:t xml:space="preserve"> excelência, segurança, qualidade e eficiência.</w:t>
       </w:r>
@@ -2944,8 +2960,8 @@
           <w:rFonts w:ascii="Arial" w:hAnsi="Arial" w:cs="Arial"/>
           <w:b/>
           <w:bCs/>
-          <w:sz w:val="24"/>
-          <w:szCs w:val="24"/>
+          <w:sz w:val="20"/>
+          <w:szCs w:val="20"/>
         </w:rPr>
       </w:pPr>
       <w:r>
@@ -2954,8 +2970,8 @@
           <w:b/>
           <w:bCs/>
           <w:noProof/>
-          <w:sz w:val="24"/>
-          <w:szCs w:val="24"/>
+          <w:sz w:val="20"/>
+          <w:szCs w:val="20"/>
         </w:rPr>
         <mc:AlternateContent>
           <mc:Choice Requires="wps">
@@ -3006,6 +3022,8 @@
                               <w:rPr>
                                 <w:b/>
                                 <w:bCs/>
+                                <w:sz w:val="20"/>
+                                <w:szCs w:val="20"/>
                               </w:rPr>
                             </w:pPr>
                             <w:r>
@@ -3013,8 +3031,8 @@
                                 <w:b/>
                                 <w:bCs/>
                                 <w:rFonts w:ascii="Arial" w:hAnsi="Arial" w:cs="Arial"/>
-                                <w:sz w:val="24"/>
-                                <w:szCs w:val="24"/>
+                                <w:sz w:val="20"/>
+                                <w:szCs w:val="20"/>
                               </w:rPr>
                               <w:t>21 anos de experiência</w:t>
                             </w:r>
@@ -3048,6 +3066,8 @@
                         <w:rPr>
                           <w:b/>
                           <w:bCs/>
+                          <w:sz w:val="20"/>
+                          <w:szCs w:val="20"/>
                         </w:rPr>
                       </w:pPr>
                       <w:r>
@@ -3055,8 +3075,8 @@
                           <w:b/>
                           <w:bCs/>
                           <w:rFonts w:ascii="Arial" w:hAnsi="Arial" w:cs="Arial"/>
-                          <w:sz w:val="24"/>
-                          <w:szCs w:val="24"/>
+                          <w:sz w:val="20"/>
+                          <w:szCs w:val="20"/>
                         </w:rPr>
                         <w:t>21 anos de experiência</w:t>
                       </w:r>
@@ -3139,8 +3159,8 @@
           <w:rFonts w:ascii="Arial" w:hAnsi="Arial" w:cs="Arial"/>
           <w:b/>
           <w:bCs/>
-          <w:sz w:val="24"/>
-          <w:szCs w:val="24"/>
+          <w:sz w:val="20"/>
+          <w:szCs w:val="20"/>
         </w:rPr>
       </w:pPr>
     </w:p>
@@ -3155,8 +3175,8 @@
           <w:rFonts w:ascii="Arial" w:hAnsi="Arial" w:cs="Arial"/>
           <w:b/>
           <w:bCs/>
-          <w:sz w:val="24"/>
-          <w:szCs w:val="24"/>
+          <w:sz w:val="20"/>
+          <w:szCs w:val="20"/>
         </w:rPr>
       </w:pPr>
     </w:p>
@@ -3171,8 +3191,8 @@
           <w:rFonts w:ascii="Arial" w:hAnsi="Arial" w:cs="Arial"/>
           <w:b/>
           <w:bCs/>
-          <w:sz w:val="24"/>
-          <w:szCs w:val="24"/>
+          <w:sz w:val="20"/>
+          <w:szCs w:val="20"/>
         </w:rPr>
       </w:pPr>
     </w:p>
@@ -3186,8 +3206,8 @@
           <w:rFonts w:ascii="Arial" w:hAnsi="Arial" w:cs="Arial"/>
           <w:b/>
           <w:noProof/>
-          <w:sz w:val="24"/>
-          <w:szCs w:val="24"/>
+          <w:sz w:val="20"/>
+          <w:szCs w:val="20"/>
         </w:rPr>
       </w:pPr>
     </w:p>
@@ -3202,8 +3222,8 @@
           <w:rFonts w:ascii="Arial" w:hAnsi="Arial" w:cs="Arial"/>
           <w:b/>
           <w:bCs/>
-          <w:sz w:val="24"/>
-          <w:szCs w:val="24"/>
+          <w:sz w:val="20"/>
+          <w:szCs w:val="20"/>
         </w:rPr>
       </w:pPr>
     </w:p>
@@ -3212,19 +3232,19 @@
         <w:pStyle w:val="Ttulo2"/>
         <w:rPr>
           <w:rFonts w:ascii="Arial" w:hAnsi="Arial" w:cs="Arial"/>
-          <w:b w:val="true"/>
-          <w:sz w:val="24"/>
-          <w:szCs w:val="24"/>
-          <w:bCs w:val="true"/>
-        </w:rPr>
-      </w:pPr>
-      <w:r>
-        <w:rPr>
-          <w:rFonts w:ascii="Arial" w:hAnsi="Arial" w:cs="Arial"/>
-          <w:b w:val="true"/>
-          <w:sz w:val="24"/>
-          <w:szCs w:val="24"/>
-          <w:bCs w:val="true"/>
+          <w:b w:val="false"/>
+          <w:sz w:val="20"/>
+          <w:szCs w:val="20"/>
+          <w:bCs w:val="false"/>
+        </w:rPr>
+      </w:pPr>
+      <w:r>
+        <w:rPr>
+          <w:rFonts w:ascii="Arial" w:hAnsi="Arial" w:cs="Arial"/>
+          <w:b w:val="false"/>
+          <w:sz w:val="20"/>
+          <w:szCs w:val="20"/>
+          <w:bCs w:val="false"/>
         </w:rPr>
         <w:t>- Tradição, excelência e referência em serviços industriais</w:t>
       </w:r>
@@ -3236,8 +3256,8 @@
         <w:rPr>
           <w:rFonts w:ascii="Arial" w:hAnsi="Arial" w:cs="Arial"/>
           <w:b/>
-          <w:sz w:val="24"/>
-          <w:szCs w:val="24"/>
+          <w:sz w:val="20"/>
+          <w:szCs w:val="20"/>
         </w:rPr>
       </w:pPr>
     </w:p>
@@ -3277,8 +3297,8 @@
               <w:rPr>
                 <w:rFonts w:ascii="Arial" w:hAnsi="Arial" w:cs="Arial"/>
                 <w:b/>
-                <w:sz w:val="24"/>
-                <w:szCs w:val="24"/>
+                <w:sz w:val="20"/>
+                <w:szCs w:val="20"/>
               </w:rPr>
               <w:spacing w:line="240" w:lineRule="auto"/>
             </w:pPr>
@@ -3286,8 +3306,8 @@
               <w:rPr>
                 <w:rFonts w:ascii="Arial" w:hAnsi="Arial" w:cs="Arial"/>
                 <w:bCs/>
-                <w:sz w:val="24"/>
-                <w:szCs w:val="24"/>
+                <w:sz w:val="20"/>
+                <w:szCs w:val="20"/>
               </w:rPr>
               <w:t>Limpeza química de tubulações e reservatórios (decapagem e passivação)</w:t>
             </w:r>
@@ -3308,8 +3328,8 @@
               <w:rPr>
                 <w:rFonts w:ascii="Arial" w:hAnsi="Arial" w:cs="Arial"/>
                 <w:b/>
-                <w:sz w:val="24"/>
-                <w:szCs w:val="24"/>
+                <w:sz w:val="20"/>
+                <w:szCs w:val="20"/>
               </w:rPr>
               <w:spacing w:line="240" w:lineRule="auto"/>
             </w:pPr>
@@ -3317,8 +3337,8 @@
               <w:rPr>
                 <w:rFonts w:ascii="Arial" w:hAnsi="Arial" w:cs="Arial"/>
                 <w:bCs/>
-                <w:sz w:val="24"/>
-                <w:szCs w:val="24"/>
+                <w:sz w:val="20"/>
+                <w:szCs w:val="20"/>
               </w:rPr>
               <w:t>Flushing primário</w:t>
             </w:r>
@@ -3341,8 +3361,8 @@
               <w:rPr>
                 <w:rFonts w:ascii="Arial" w:hAnsi="Arial" w:cs="Arial"/>
                 <w:b/>
-                <w:sz w:val="24"/>
-                <w:szCs w:val="24"/>
+                <w:sz w:val="20"/>
+                <w:szCs w:val="20"/>
               </w:rPr>
               <w:spacing w:line="240" w:lineRule="auto"/>
             </w:pPr>
@@ -3350,8 +3370,8 @@
               <w:rPr>
                 <w:rFonts w:ascii="Arial" w:hAnsi="Arial" w:cs="Arial"/>
                 <w:bCs/>
-                <w:sz w:val="24"/>
-                <w:szCs w:val="24"/>
+                <w:sz w:val="20"/>
+                <w:szCs w:val="20"/>
               </w:rPr>
               <w:t>Flushing secundário</w:t>
             </w:r>
@@ -3372,8 +3392,8 @@
               <w:rPr>
                 <w:rFonts w:ascii="Arial" w:hAnsi="Arial" w:cs="Arial"/>
                 <w:b/>
-                <w:sz w:val="24"/>
-                <w:szCs w:val="24"/>
+                <w:sz w:val="20"/>
+                <w:szCs w:val="20"/>
               </w:rPr>
               <w:spacing w:line="240" w:lineRule="auto"/>
             </w:pPr>
@@ -3381,8 +3401,8 @@
               <w:rPr>
                 <w:rFonts w:ascii="Arial" w:hAnsi="Arial" w:cs="Arial"/>
                 <w:bCs/>
-                <w:sz w:val="24"/>
-                <w:szCs w:val="24"/>
+                <w:sz w:val="20"/>
+                <w:szCs w:val="20"/>
               </w:rPr>
               <w:t xml:space="preserve">Passagem de </w:t>
             </w:r>
@@ -3390,8 +3410,8 @@
               <w:rPr>
                 <w:rFonts w:ascii="Arial" w:hAnsi="Arial" w:cs="Arial"/>
                 <w:bCs/>
-                <w:sz w:val="24"/>
-                <w:szCs w:val="24"/>
+                <w:sz w:val="20"/>
+                <w:szCs w:val="20"/>
               </w:rPr>
               <w:t>PIG</w:t>
             </w:r>
@@ -3399,8 +3419,8 @@
               <w:rPr>
                 <w:rFonts w:ascii="Arial" w:hAnsi="Arial" w:cs="Arial"/>
                 <w:bCs/>
-                <w:sz w:val="24"/>
-                <w:szCs w:val="24"/>
+                <w:sz w:val="20"/>
+                <w:szCs w:val="20"/>
               </w:rPr>
               <w:t xml:space="preserve"> de espuma</w:t>
             </w:r>
@@ -3423,8 +3443,8 @@
               <w:rPr>
                 <w:rFonts w:ascii="Arial" w:hAnsi="Arial" w:cs="Arial"/>
                 <w:b/>
-                <w:sz w:val="24"/>
-                <w:szCs w:val="24"/>
+                <w:sz w:val="20"/>
+                <w:szCs w:val="20"/>
               </w:rPr>
               <w:spacing w:line="240" w:lineRule="auto"/>
             </w:pPr>
@@ -3432,8 +3452,8 @@
               <w:rPr>
                 <w:rFonts w:ascii="Arial" w:hAnsi="Arial" w:cs="Arial"/>
                 <w:bCs/>
-                <w:sz w:val="24"/>
-                <w:szCs w:val="24"/>
+                <w:sz w:val="20"/>
+                <w:szCs w:val="20"/>
               </w:rPr>
               <w:t>Filtragem absoluta</w:t>
             </w:r>
@@ -3454,8 +3474,8 @@
               <w:rPr>
                 <w:rFonts w:ascii="Arial" w:hAnsi="Arial" w:cs="Arial"/>
                 <w:b/>
-                <w:sz w:val="24"/>
-                <w:szCs w:val="24"/>
+                <w:sz w:val="20"/>
+                <w:szCs w:val="20"/>
               </w:rPr>
               <w:spacing w:line="240" w:lineRule="auto"/>
             </w:pPr>
@@ -3463,8 +3483,8 @@
               <w:rPr>
                 <w:rFonts w:ascii="Arial" w:hAnsi="Arial" w:cs="Arial"/>
                 <w:bCs/>
-                <w:sz w:val="24"/>
-                <w:szCs w:val="24"/>
+                <w:sz w:val="20"/>
+                <w:szCs w:val="20"/>
               </w:rPr>
               <w:t>T</w:t>
             </w:r>
@@ -3472,8 +3492,8 @@
               <w:rPr>
                 <w:rFonts w:ascii="Arial" w:hAnsi="Arial" w:cs="Arial"/>
                 <w:bCs/>
-                <w:sz w:val="24"/>
-                <w:szCs w:val="24"/>
+                <w:sz w:val="20"/>
+                <w:szCs w:val="20"/>
               </w:rPr>
               <w:t>este de pressão (teste hidrostático)</w:t>
             </w:r>
@@ -3496,8 +3516,8 @@
               <w:rPr>
                 <w:rFonts w:ascii="Arial" w:hAnsi="Arial" w:cs="Arial"/>
                 <w:bCs/>
-                <w:sz w:val="24"/>
-                <w:szCs w:val="24"/>
+                <w:sz w:val="20"/>
+                <w:szCs w:val="20"/>
               </w:rPr>
               <w:spacing w:line="240" w:lineRule="auto"/>
             </w:pPr>
@@ -3505,8 +3525,8 @@
               <w:rPr>
                 <w:rFonts w:ascii="Arial" w:hAnsi="Arial" w:cs="Arial"/>
                 <w:bCs/>
-                <w:sz w:val="24"/>
-                <w:szCs w:val="24"/>
+                <w:sz w:val="20"/>
+                <w:szCs w:val="20"/>
               </w:rPr>
               <w:t xml:space="preserve">Centrifugação e </w:t>
             </w:r>
@@ -3514,8 +3534,8 @@
               <w:rPr>
                 <w:rFonts w:ascii="Arial" w:hAnsi="Arial" w:cs="Arial"/>
                 <w:bCs/>
-                <w:sz w:val="24"/>
-                <w:szCs w:val="24"/>
+                <w:sz w:val="20"/>
+                <w:szCs w:val="20"/>
               </w:rPr>
               <w:t>desidratação de óleo</w:t>
             </w:r>
@@ -3532,8 +3552,8 @@
               <w:rPr>
                 <w:rFonts w:ascii="Arial" w:hAnsi="Arial" w:cs="Arial"/>
                 <w:bCs/>
-                <w:sz w:val="24"/>
-                <w:szCs w:val="24"/>
+                <w:sz w:val="20"/>
+                <w:szCs w:val="20"/>
               </w:rPr>
               <w:spacing w:line="240" w:lineRule="auto"/>
             </w:pPr>
@@ -3547,8 +3567,8 @@
         <w:rPr>
           <w:rFonts w:ascii="Arial" w:hAnsi="Arial" w:cs="Arial"/>
           <w:b/>
-          <w:sz w:val="24"/>
-          <w:szCs w:val="24"/>
+          <w:sz w:val="20"/>
+          <w:szCs w:val="20"/>
         </w:rPr>
       </w:pPr>
       <w:r>
@@ -3593,8 +3613,8 @@
               <w:rPr>
                 <w:rFonts w:ascii="Arial" w:hAnsi="Arial" w:cs="Arial"/>
                 <w:b/>
-                <w:sz w:val="24"/>
-                <w:szCs w:val="24"/>
+                <w:sz w:val="20"/>
+                <w:szCs w:val="20"/>
               </w:rPr>
               <w:spacing w:line="240" w:lineRule="auto"/>
             </w:pPr>
@@ -3664,8 +3684,8 @@
               <w:rPr>
                 <w:rFonts w:ascii="Arial" w:hAnsi="Arial" w:cs="Arial"/>
                 <w:b/>
-                <w:sz w:val="24"/>
-                <w:szCs w:val="24"/>
+                <w:sz w:val="20"/>
+                <w:szCs w:val="20"/>
               </w:rPr>
               <w:spacing w:line="240" w:lineRule="auto"/>
             </w:pPr>
@@ -3726,8 +3746,8 @@
               <w:rPr>
                 <w:rFonts w:ascii="Arial" w:hAnsi="Arial" w:cs="Arial"/>
                 <w:b/>
-                <w:sz w:val="24"/>
-                <w:szCs w:val="24"/>
+                <w:sz w:val="20"/>
+                <w:szCs w:val="20"/>
               </w:rPr>
               <w:spacing w:line="240" w:lineRule="auto"/>
             </w:pPr>
@@ -3788,8 +3808,8 @@
               <w:rPr>
                 <w:rFonts w:ascii="Arial" w:hAnsi="Arial" w:cs="Arial"/>
                 <w:b/>
-                <w:sz w:val="24"/>
-                <w:szCs w:val="24"/>
+                <w:sz w:val="20"/>
+                <w:szCs w:val="20"/>
               </w:rPr>
               <w:spacing w:line="240" w:lineRule="auto"/>
             </w:pPr>
@@ -3847,8 +3867,8 @@
         <w:rPr>
           <w:rFonts w:ascii="Arial" w:hAnsi="Arial" w:cs="Arial"/>
           <w:b/>
-          <w:sz w:val="24"/>
-          <w:szCs w:val="24"/>
+          <w:sz w:val="20"/>
+          <w:szCs w:val="20"/>
         </w:rPr>
       </w:pPr>
     </w:p>
@@ -3857,69 +3877,69 @@
         <w:pStyle w:val="Ttulo2"/>
         <w:rPr>
           <w:rFonts w:ascii="Arial" w:hAnsi="Arial" w:cs="Arial"/>
-          <w:sz w:val="24"/>
-          <w:szCs w:val="24"/>
-          <w:b w:val="true"/>
-          <w:bCs w:val="true"/>
-        </w:rPr>
-      </w:pPr>
-      <w:r>
-        <w:rPr>
-          <w:rFonts w:ascii="Arial" w:hAnsi="Arial" w:cs="Arial"/>
-          <w:b w:val="true"/>
-          <w:sz w:val="24"/>
-          <w:szCs w:val="24"/>
-          <w:bCs w:val="true"/>
+          <w:sz w:val="20"/>
+          <w:szCs w:val="20"/>
+          <w:b w:val="false"/>
+          <w:bCs w:val="false"/>
+        </w:rPr>
+      </w:pPr>
+      <w:r>
+        <w:rPr>
+          <w:rFonts w:ascii="Arial" w:hAnsi="Arial" w:cs="Arial"/>
+          <w:b w:val="false"/>
+          <w:sz w:val="20"/>
+          <w:szCs w:val="20"/>
+          <w:bCs w:val="false"/>
         </w:rPr>
         <w:t xml:space="preserve"/>
       </w:r>
       <w:r>
         <w:rPr>
           <w:rFonts w:ascii="Arial" w:hAnsi="Arial" w:cs="Arial"/>
-          <w:b w:val="true"/>
-          <w:sz w:val="24"/>
-          <w:szCs w:val="24"/>
-          <w:bCs w:val="true"/>
+          <w:b w:val="false"/>
+          <w:sz w:val="20"/>
+          <w:szCs w:val="20"/>
+          <w:bCs w:val="false"/>
         </w:rPr>
         <w:t>-</w:t>
       </w:r>
       <w:r>
         <w:rPr>
           <w:rFonts w:ascii="Arial" w:hAnsi="Arial" w:cs="Arial"/>
-          <w:b w:val="true"/>
-          <w:sz w:val="24"/>
-          <w:szCs w:val="24"/>
-          <w:bCs w:val="true"/>
+          <w:b w:val="false"/>
+          <w:sz w:val="20"/>
+          <w:szCs w:val="20"/>
+          <w:bCs w:val="false"/>
         </w:rPr>
         <w:t xml:space="preserve"> </w:t>
       </w:r>
       <w:r>
         <w:rPr>
           <w:rFonts w:ascii="Arial" w:hAnsi="Arial" w:cs="Arial"/>
-          <w:b w:val="true"/>
-          <w:sz w:val="24"/>
-          <w:szCs w:val="24"/>
-          <w:bCs w:val="true"/>
+          <w:b w:val="false"/>
+          <w:sz w:val="20"/>
+          <w:szCs w:val="20"/>
+          <w:bCs w:val="false"/>
         </w:rPr>
         <w:t>Equipamentos modernos, revisados e</w:t>
       </w:r>
       <w:r>
         <w:rPr>
           <w:rFonts w:ascii="Arial" w:hAnsi="Arial" w:cs="Arial"/>
-          <w:b w:val="true"/>
-          <w:sz w:val="24"/>
-          <w:szCs w:val="24"/>
-          <w:bCs w:val="true"/>
+          <w:b w:val="false"/>
+          <w:sz w:val="20"/>
+          <w:szCs w:val="20"/>
+          <w:bCs w:val="false"/>
         </w:rPr>
         <w:t xml:space="preserve"> alto desempenho e tecnologia</w:t>
       </w:r>
       <w:r>
         <w:rPr>
           <w:rFonts w:ascii="Arial" w:hAnsi="Arial" w:cs="Arial"/>
-          <w:b w:val="true"/>
-          <w:sz w:val="24"/>
-          <w:szCs w:val="24"/>
-          <w:bCs w:val="true"/>
+          <w:b w:val="false"/>
+          <w:sz w:val="20"/>
+          <w:szCs w:val="20"/>
+          <w:bCs w:val="false"/>
         </w:rPr>
         <w:t xml:space="preserve"> para atender qualquer demanda.</w:t>
       </w:r>
@@ -3958,8 +3978,8 @@
               <w:rPr>
                 <w:rFonts w:ascii="Arial" w:hAnsi="Arial" w:cs="Arial"/>
                 <w:bCs/>
-                <w:sz w:val="24"/>
-                <w:szCs w:val="24"/>
+                <w:sz w:val="20"/>
+                <w:szCs w:val="20"/>
               </w:rPr>
               <w:spacing w:line="240" w:lineRule="auto"/>
             </w:pPr>
@@ -4018,8 +4038,8 @@
               <w:rPr>
                 <w:rFonts w:ascii="Arial" w:hAnsi="Arial" w:cs="Arial"/>
                 <w:bCs/>
-                <w:sz w:val="24"/>
-                <w:szCs w:val="24"/>
+                <w:sz w:val="20"/>
+                <w:szCs w:val="20"/>
               </w:rPr>
               <w:spacing w:line="240" w:lineRule="auto"/>
             </w:pPr>
@@ -4079,8 +4099,8 @@
               <w:rPr>
                 <w:rFonts w:ascii="Arial" w:hAnsi="Arial" w:cs="Arial"/>
                 <w:bCs/>
-                <w:sz w:val="24"/>
-                <w:szCs w:val="24"/>
+                <w:sz w:val="20"/>
+                <w:szCs w:val="20"/>
               </w:rPr>
               <w:spacing w:line="240" w:lineRule="auto"/>
             </w:pPr>
@@ -4140,8 +4160,8 @@
               <w:rPr>
                 <w:rFonts w:ascii="Arial" w:hAnsi="Arial" w:cs="Arial"/>
                 <w:bCs/>
-                <w:sz w:val="24"/>
-                <w:szCs w:val="24"/>
+                <w:sz w:val="20"/>
+                <w:szCs w:val="20"/>
               </w:rPr>
               <w:spacing w:line="240" w:lineRule="auto"/>
             </w:pPr>
@@ -4222,8 +4242,8 @@
         <w:rPr>
           <w:rFonts w:ascii="Arial" w:hAnsi="Arial" w:cs="Arial"/>
           <w:bCs/>
-          <w:sz w:val="24"/>
-          <w:szCs w:val="24"/>
+          <w:sz w:val="20"/>
+          <w:szCs w:val="20"/>
         </w:rPr>
       </w:pPr>
     </w:p>
@@ -4232,19 +4252,19 @@
         <w:pStyle w:val="Ttulo2"/>
         <w:rPr>
           <w:rFonts w:ascii="Arial" w:hAnsi="Arial" w:cs="Arial"/>
-          <w:sz w:val="24"/>
-          <w:szCs w:val="24"/>
-          <w:b w:val="true"/>
-          <w:bCs w:val="true"/>
-        </w:rPr>
-      </w:pPr>
-      <w:r>
-        <w:rPr>
-          <w:rFonts w:ascii="Arial" w:hAnsi="Arial" w:cs="Arial"/>
-          <w:b w:val="true"/>
-          <w:sz w:val="24"/>
-          <w:szCs w:val="24"/>
-          <w:bCs w:val="true"/>
+          <w:sz w:val="20"/>
+          <w:szCs w:val="20"/>
+          <w:b w:val="false"/>
+          <w:bCs w:val="false"/>
+        </w:rPr>
+      </w:pPr>
+      <w:r>
+        <w:rPr>
+          <w:rFonts w:ascii="Arial" w:hAnsi="Arial" w:cs="Arial"/>
+          <w:b w:val="false"/>
+          <w:sz w:val="20"/>
+          <w:szCs w:val="20"/>
+          <w:bCs w:val="false"/>
         </w:rPr>
         <w:t>- Clientes que confiam e atestam a excelência da Filtrovali</w:t>
       </w:r>
@@ -4256,8 +4276,8 @@
         <w:rPr>
           <w:rFonts w:ascii="Arial" w:hAnsi="Arial" w:cs="Arial"/>
           <w:b/>
-          <w:sz w:val="24"/>
-          <w:szCs w:val="24"/>
+          <w:sz w:val="20"/>
+          <w:szCs w:val="20"/>
         </w:rPr>
       </w:pPr>
       <w:r>
@@ -4321,8 +4341,8 @@
           <w:rFonts w:ascii="Arial" w:hAnsi="Arial" w:cs="Arial"/>
           <w:b/>
           <w:bCs/>
-          <w:sz w:val="24"/>
-          <w:szCs w:val="24"/>
+          <w:sz w:val="20"/>
+          <w:szCs w:val="20"/>
         </w:rPr>
       </w:pPr>
     </w:p>
@@ -4333,8 +4353,8 @@
         <w:jc w:val="both"/>
         <w:rPr>
           <w:rFonts w:ascii="Arial" w:hAnsi="Arial" w:cs="Arial"/>
-          <w:sz w:val="24"/>
-          <w:szCs w:val="24"/>
+          <w:sz w:val="20"/>
+          <w:szCs w:val="20"/>
           <w:b w:val="true"/>
           <w:bCs w:val="true"/>
         </w:rPr>
@@ -4345,8 +4365,8 @@
           <w:rFonts w:ascii="Arial" w:hAnsi="Arial" w:cs="Arial"/>
           <w:b w:val="true"/>
           <w:bCs w:val="true"/>
-          <w:sz w:val="24"/>
-          <w:szCs w:val="24"/>
+          <w:sz w:val="20"/>
+          <w:szCs w:val="20"/>
         </w:rPr>
         <w:t xml:space="preserve">- </w:t>
       </w:r>
@@ -4355,8 +4375,8 @@
           <w:rFonts w:ascii="Arial" w:hAnsi="Arial" w:cs="Arial"/>
           <w:b w:val="true"/>
           <w:bCs w:val="true"/>
-          <w:sz w:val="24"/>
-          <w:szCs w:val="24"/>
+          <w:sz w:val="20"/>
+          <w:szCs w:val="20"/>
         </w:rPr>
         <w:t>Descrição dos serviços que serão executados:</w:t>
       </w:r>
@@ -4369,19 +4389,19 @@
         <w:jc w:val="both"/>
         <w:rPr>
           <w:rFonts w:ascii="Arial" w:hAnsi="Arial" w:cs="Arial"/>
-          <w:sz w:val="24"/>
-          <w:szCs w:val="24"/>
-          <w:b w:val="true"/>
-          <w:bCs w:val="true"/>
-        </w:rPr>
-      </w:pPr>
-      <w:r>
-        <w:rPr>
-          <w:rFonts w:ascii="Arial" w:hAnsi="Arial" w:cs="Arial"/>
-          <w:sz w:val="24"/>
-          <w:szCs w:val="24"/>
-          <w:b w:val="true"/>
-          <w:bCs w:val="true"/>
+          <w:sz w:val="20"/>
+          <w:szCs w:val="20"/>
+          <w:b w:val="false"/>
+          <w:bCs w:val="false"/>
+        </w:rPr>
+      </w:pPr>
+      <w:r>
+        <w:rPr>
+          <w:rFonts w:ascii="Arial" w:hAnsi="Arial" w:cs="Arial"/>
+          <w:sz w:val="20"/>
+          <w:szCs w:val="20"/>
+          <w:b w:val="false"/>
+          <w:bCs w:val="false"/>
         </w:rPr>
         <w:t xml:space="preserve">{{servico}}</w:t>
       </w:r>
@@ -4397,15 +4417,19 @@
         <w:jc w:val="both"/>
         <w:rPr>
           <w:rFonts w:ascii="Arial" w:hAnsi="Arial" w:cs="Arial"/>
-          <w:sz w:val="24"/>
-          <w:szCs w:val="24"/>
-        </w:rPr>
-      </w:pPr>
-      <w:r>
-        <w:rPr>
-          <w:rFonts w:ascii="Arial" w:hAnsi="Arial" w:cs="Arial"/>
-          <w:sz w:val="24"/>
-          <w:szCs w:val="24"/>
+          <w:bCs w:val="false"/>
+          <w:b w:val="false"/>
+          <w:sz w:val="20"/>
+          <w:szCs w:val="20"/>
+        </w:rPr>
+      </w:pPr>
+      <w:r>
+        <w:rPr>
+          <w:rFonts w:ascii="Arial" w:hAnsi="Arial" w:cs="Arial"/>
+          <w:bCs w:val="false"/>
+          <w:b w:val="false"/>
+          <w:sz w:val="20"/>
+          <w:szCs w:val="20"/>
         </w:rPr>
         <w:t>{{escopo_blocos}}</w:t>
       </w:r>
@@ -4417,15 +4441,15 @@
         <w:ind w:left="360"/>
         <w:rPr>
           <w:rFonts w:ascii="Arial" w:hAnsi="Arial" w:cs="Arial"/>
-          <w:sz w:val="24"/>
-          <w:szCs w:val="24"/>
-        </w:rPr>
-      </w:pPr>
-      <w:r>
-        <w:rPr>
-          <w:rFonts w:ascii="Arial" w:hAnsi="Arial" w:cs="Arial"/>
-          <w:sz w:val="24"/>
-          <w:szCs w:val="24"/>
+          <w:sz w:val="20"/>
+          <w:szCs w:val="20"/>
+        </w:rPr>
+      </w:pPr>
+      <w:r>
+        <w:rPr>
+          <w:rFonts w:ascii="Arial" w:hAnsi="Arial" w:cs="Arial"/>
+          <w:sz w:val="20"/>
+          <w:szCs w:val="20"/>
         </w:rPr>
         <w:t xml:space="preserve">NOTA: As tubulações embarcadas, exemplo - aquelas que compõe uma unidade hidráulica ou um Skid de bombas, </w:t>
       </w:r>
@@ -4437,15 +4461,15 @@
         <w:ind w:left="360"/>
         <w:rPr>
           <w:rFonts w:ascii="Arial" w:hAnsi="Arial" w:cs="Arial"/>
-          <w:sz w:val="24"/>
-          <w:szCs w:val="24"/>
-        </w:rPr>
-      </w:pPr>
-      <w:r>
-        <w:rPr>
-          <w:rFonts w:ascii="Arial" w:hAnsi="Arial" w:cs="Arial"/>
-          <w:sz w:val="24"/>
-          <w:szCs w:val="24"/>
+          <w:sz w:val="20"/>
+          <w:szCs w:val="20"/>
+        </w:rPr>
+      </w:pPr>
+      <w:r>
+        <w:rPr>
+          <w:rFonts w:ascii="Arial" w:hAnsi="Arial" w:cs="Arial"/>
+          <w:sz w:val="20"/>
+          <w:szCs w:val="20"/>
         </w:rPr>
         <w:t>não fazem parte do escopo.</w:t>
       </w:r>
@@ -4456,8 +4480,8 @@
         <w:spacing w:after="120"/>
         <w:rPr>
           <w:rFonts w:ascii="Arial" w:hAnsi="Arial" w:cs="Arial"/>
-          <w:sz w:val="24"/>
-          <w:szCs w:val="24"/>
+          <w:sz w:val="20"/>
+          <w:szCs w:val="20"/>
           <w:b w:val="true"/>
           <w:bCs w:val="true"/>
         </w:rPr>
@@ -4469,8 +4493,8 @@
           <w:rFonts w:ascii="Arial" w:hAnsi="Arial" w:cs="Arial"/>
           <w:b w:val="true"/>
           <w:bCs w:val="true"/>
-          <w:sz w:val="24"/>
-          <w:szCs w:val="24"/>
+          <w:sz w:val="20"/>
+          <w:szCs w:val="20"/>
         </w:rPr>
         <w:t xml:space="preserve">- </w:t>
       </w:r>
@@ -4480,8 +4504,8 @@
           <w:b w:val="true"/>
           <w:bCs w:val="true"/>
           <w:color w:val="000000"/>
-          <w:sz w:val="24"/>
-          <w:szCs w:val="24"/>
+          <w:sz w:val="20"/>
+          <w:szCs w:val="20"/>
         </w:rPr>
         <w:t>Matriz geral de responsabilidade</w:t>
       </w:r>
@@ -4493,30 +4517,30 @@
         <w:spacing w:after="120"/>
         <w:rPr>
           <w:rFonts w:ascii="Arial" w:hAnsi="Arial" w:cs="Arial"/>
-          <w:sz w:val="24"/>
-          <w:szCs w:val="24"/>
-          <w:b w:val="true"/>
-          <w:bCs w:val="true"/>
-        </w:rPr>
-      </w:pPr>
-      <w:r>
-        <w:rPr>
-          <w:rFonts w:ascii="Arial" w:hAnsi="Arial" w:cs="Arial"/>
-          <w:b w:val="true"/>
-          <w:bCs w:val="true"/>
+          <w:sz w:val="20"/>
+          <w:szCs w:val="20"/>
+          <w:b w:val="false"/>
+          <w:bCs w:val="false"/>
+        </w:rPr>
+      </w:pPr>
+      <w:r>
+        <w:rPr>
+          <w:rFonts w:ascii="Arial" w:hAnsi="Arial" w:cs="Arial"/>
+          <w:b w:val="false"/>
+          <w:bCs w:val="false"/>
           <w:color w:val="000000"/>
-          <w:sz w:val="24"/>
-          <w:szCs w:val="24"/>
+          <w:sz w:val="20"/>
+          <w:szCs w:val="20"/>
         </w:rPr>
         <w:t>Responsabilidade da Filtrovali</w:t>
       </w:r>
       <w:r>
         <w:rPr>
           <w:rFonts w:ascii="Arial" w:hAnsi="Arial" w:cs="Arial"/>
-          <w:b w:val="true"/>
-          <w:bCs w:val="true"/>
-          <w:sz w:val="24"/>
-          <w:szCs w:val="24"/>
+          <w:b w:val="false"/>
+          <w:bCs w:val="false"/>
+          <w:sz w:val="20"/>
+          <w:szCs w:val="20"/>
         </w:rPr>
         <w:t>:</w:t>
       </w:r>
@@ -4565,8 +4589,8 @@
                 <w:bCs/>
                 <w:color w:val="FFFFFF" w:themeColor="background1"/>
                 <w:lang w:eastAsia="pt-BR"/>
-                <w:sz w:val="24"/>
-                <w:szCs w:val="24"/>
+                <w:sz w:val="20"/>
+                <w:szCs w:val="20"/>
               </w:rPr>
             </w:pPr>
             <w:r>
@@ -4576,8 +4600,8 @@
                 <w:bCs/>
                 <w:color w:val="FFFFFF" w:themeColor="background1"/>
                 <w:lang w:eastAsia="pt-BR"/>
-                <w:sz w:val="24"/>
-                <w:szCs w:val="24"/>
+                <w:sz w:val="20"/>
+                <w:szCs w:val="20"/>
               </w:rPr>
               <w:t>Item</w:t>
             </w:r>
@@ -4607,8 +4631,8 @@
                 <w:bCs/>
                 <w:color w:val="FFFFFF" w:themeColor="background1"/>
                 <w:lang w:eastAsia="pt-BR"/>
-                <w:sz w:val="24"/>
-                <w:szCs w:val="24"/>
+                <w:sz w:val="20"/>
+                <w:szCs w:val="20"/>
               </w:rPr>
             </w:pPr>
             <w:r>
@@ -4618,8 +4642,8 @@
                 <w:bCs/>
                 <w:color w:val="FFFFFF" w:themeColor="background1"/>
                 <w:lang w:eastAsia="pt-BR"/>
-                <w:sz w:val="24"/>
-                <w:szCs w:val="24"/>
+                <w:sz w:val="20"/>
+                <w:szCs w:val="20"/>
               </w:rPr>
               <w:t>ESCOPO</w:t>
             </w:r>
@@ -4649,8 +4673,8 @@
                 <w:bCs/>
                 <w:color w:val="FFFFFF" w:themeColor="background1"/>
                 <w:lang w:eastAsia="pt-BR"/>
-                <w:sz w:val="24"/>
-                <w:szCs w:val="24"/>
+                <w:sz w:val="20"/>
+                <w:szCs w:val="20"/>
               </w:rPr>
             </w:pPr>
             <w:r>
@@ -4660,8 +4684,8 @@
                 <w:bCs/>
                 <w:color w:val="FFFFFF" w:themeColor="background1"/>
                 <w:lang w:eastAsia="pt-BR"/>
-                <w:sz w:val="24"/>
-                <w:szCs w:val="24"/>
+                <w:sz w:val="20"/>
+                <w:szCs w:val="20"/>
               </w:rPr>
               <w:t>NOTA</w:t>
             </w:r>
@@ -4696,8 +4720,8 @@
                 <w:bCs/>
                 <w:color w:val="000000"/>
                 <w:lang w:eastAsia="pt-BR"/>
-                <w:sz w:val="24"/>
-                <w:szCs w:val="24"/>
+                <w:sz w:val="20"/>
+                <w:szCs w:val="20"/>
               </w:rPr>
             </w:pPr>
             <w:r>
@@ -4707,8 +4731,8 @@
                 <w:bCs/>
                 <w:color w:val="000000"/>
                 <w:lang w:eastAsia="pt-BR"/>
-                <w:sz w:val="24"/>
-                <w:szCs w:val="24"/>
+                <w:sz w:val="20"/>
+                <w:szCs w:val="20"/>
               </w:rPr>
               <w:t xml:space="preserve">{{categoria_filtrovali}}</w:t>
             </w:r>
@@ -4744,10 +4768,12 @@
               <w:jc w:val="center"/>
               <w:rPr>
                 <w:rFonts w:ascii="Arial" w:hAnsi="Arial" w:cs="Arial"/>
+                <w:bCs w:val="false"/>
+                <w:b w:val="false"/>
                 <w:color w:val="000000"/>
                 <w:lang w:eastAsia="pt-BR"/>
-                <w:sz w:val="24"/>
-                <w:szCs w:val="24"/>
+                <w:sz w:val="20"/>
+                <w:szCs w:val="20"/>
               </w:rPr>
             </w:pPr>
           </w:p>
@@ -4771,8 +4797,8 @@
                 <w:rFonts w:ascii="Arial" w:hAnsi="Arial" w:cs="Arial"/>
                 <w:color w:val="000000"/>
                 <w:lang w:eastAsia="pt-BR"/>
-                <w:sz w:val="24"/>
-                <w:szCs w:val="24"/>
+                <w:sz w:val="20"/>
+                <w:szCs w:val="20"/>
               </w:rPr>
             </w:pPr>
             <w:r>
@@ -4780,8 +4806,8 @@
                 <w:rFonts w:ascii="Arial" w:hAnsi="Arial" w:cs="Arial"/>
                 <w:color w:val="000000"/>
                 <w:lang w:eastAsia="pt-BR"/>
-                <w:sz w:val="24"/>
-                <w:szCs w:val="24"/>
+                <w:sz w:val="20"/>
+                <w:szCs w:val="20"/>
               </w:rPr>
               <w:t xml:space="preserve">{{escopo_filtrovali}}</w:t>
             </w:r>
@@ -4807,8 +4833,8 @@
                 <w:rFonts w:ascii="Arial" w:hAnsi="Arial" w:cs="Arial"/>
                 <w:color w:val="000000"/>
                 <w:lang w:eastAsia="pt-BR"/>
-                <w:sz w:val="24"/>
-                <w:szCs w:val="24"/>
+                <w:sz w:val="20"/>
+                <w:szCs w:val="20"/>
               </w:rPr>
             </w:pPr>
             <w:r>
@@ -4816,8 +4842,8 @@
                 <w:rFonts w:ascii="Arial" w:hAnsi="Arial" w:cs="Arial"/>
                 <w:color w:val="000000"/>
                 <w:lang w:eastAsia="pt-BR"/>
-                <w:sz w:val="24"/>
-                <w:szCs w:val="24"/>
+                <w:sz w:val="20"/>
+                <w:szCs w:val="20"/>
               </w:rPr>
               <w:t xml:space="preserve">{{nota_filtrovali}}</w:t>
             </w:r>
@@ -4831,30 +4857,30 @@
         <w:spacing w:after="120"/>
         <w:rPr>
           <w:rFonts w:ascii="Arial" w:hAnsi="Arial" w:cs="Arial"/>
-          <w:sz w:val="24"/>
-          <w:szCs w:val="24"/>
-          <w:b w:val="true"/>
-          <w:bCs w:val="true"/>
-        </w:rPr>
-      </w:pPr>
-      <w:r>
-        <w:rPr>
-          <w:rFonts w:ascii="Arial" w:hAnsi="Arial" w:cs="Arial"/>
-          <w:b w:val="true"/>
-          <w:bCs w:val="true"/>
+          <w:sz w:val="20"/>
+          <w:szCs w:val="20"/>
+          <w:b w:val="false"/>
+          <w:bCs w:val="false"/>
+        </w:rPr>
+      </w:pPr>
+      <w:r>
+        <w:rPr>
+          <w:rFonts w:ascii="Arial" w:hAnsi="Arial" w:cs="Arial"/>
+          <w:b w:val="false"/>
+          <w:bCs w:val="false"/>
           <w:color w:val="000000"/>
-          <w:sz w:val="24"/>
-          <w:szCs w:val="24"/>
+          <w:sz w:val="20"/>
+          <w:szCs w:val="20"/>
         </w:rPr>
         <w:t>Responsabilidade do Contratante</w:t>
       </w:r>
       <w:r>
         <w:rPr>
           <w:rFonts w:ascii="Arial" w:hAnsi="Arial" w:cs="Arial"/>
-          <w:b w:val="true"/>
-          <w:bCs w:val="true"/>
-          <w:sz w:val="24"/>
-          <w:szCs w:val="24"/>
+          <w:b w:val="false"/>
+          <w:bCs w:val="false"/>
+          <w:sz w:val="20"/>
+          <w:szCs w:val="20"/>
         </w:rPr>
         <w:t>:</w:t>
       </w:r>
@@ -4903,8 +4929,8 @@
                 <w:bCs/>
                 <w:color w:val="FFFFFF" w:themeColor="background1"/>
                 <w:lang w:eastAsia="pt-BR"/>
-                <w:sz w:val="24"/>
-                <w:szCs w:val="24"/>
+                <w:sz w:val="20"/>
+                <w:szCs w:val="20"/>
               </w:rPr>
             </w:pPr>
             <w:r>
@@ -4914,8 +4940,8 @@
                 <w:bCs/>
                 <w:color w:val="FFFFFF" w:themeColor="background1"/>
                 <w:lang w:eastAsia="pt-BR"/>
-                <w:sz w:val="24"/>
-                <w:szCs w:val="24"/>
+                <w:sz w:val="20"/>
+                <w:szCs w:val="20"/>
               </w:rPr>
               <w:t>Item</w:t>
             </w:r>
@@ -4945,8 +4971,8 @@
                 <w:bCs/>
                 <w:color w:val="FFFFFF" w:themeColor="background1"/>
                 <w:lang w:eastAsia="pt-BR"/>
-                <w:sz w:val="24"/>
-                <w:szCs w:val="24"/>
+                <w:sz w:val="20"/>
+                <w:szCs w:val="20"/>
               </w:rPr>
             </w:pPr>
             <w:r>
@@ -4956,8 +4982,8 @@
                 <w:bCs/>
                 <w:color w:val="FFFFFF" w:themeColor="background1"/>
                 <w:lang w:eastAsia="pt-BR"/>
-                <w:sz w:val="24"/>
-                <w:szCs w:val="24"/>
+                <w:sz w:val="20"/>
+                <w:szCs w:val="20"/>
               </w:rPr>
               <w:t>ESCOPO</w:t>
             </w:r>
@@ -4987,8 +5013,8 @@
                 <w:bCs/>
                 <w:color w:val="FFFFFF" w:themeColor="background1"/>
                 <w:lang w:eastAsia="pt-BR"/>
-                <w:sz w:val="24"/>
-                <w:szCs w:val="24"/>
+                <w:sz w:val="20"/>
+                <w:szCs w:val="20"/>
               </w:rPr>
             </w:pPr>
             <w:r>
@@ -4998,8 +5024,8 @@
                 <w:bCs/>
                 <w:color w:val="FFFFFF" w:themeColor="background1"/>
                 <w:lang w:eastAsia="pt-BR"/>
-                <w:sz w:val="24"/>
-                <w:szCs w:val="24"/>
+                <w:sz w:val="20"/>
+                <w:szCs w:val="20"/>
               </w:rPr>
               <w:t>NOTA</w:t>
             </w:r>
@@ -5033,8 +5059,8 @@
                 <w:rFonts w:ascii="Arial" w:hAnsi="Arial" w:cs="Arial"/>
                 <w:color w:val="000000"/>
                 <w:lang w:eastAsia="pt-BR"/>
-                <w:sz w:val="24"/>
-                <w:szCs w:val="24"/>
+                <w:sz w:val="20"/>
+                <w:szCs w:val="20"/>
               </w:rPr>
             </w:pPr>
             <w:r>
@@ -5043,8 +5069,8 @@
                 <w:b/>
                 <w:color w:val="000000"/>
                 <w:lang w:eastAsia="pt-BR"/>
-                <w:sz w:val="24"/>
-                <w:szCs w:val="24"/>
+                <w:sz w:val="20"/>
+                <w:szCs w:val="20"/>
               </w:rPr>
               <w:t xml:space="preserve">{{categoria_contratante}}</w:t>
             </w:r>
@@ -5080,10 +5106,12 @@
               <w:jc w:val="center"/>
               <w:rPr>
                 <w:rFonts w:ascii="Arial" w:hAnsi="Arial" w:cs="Arial"/>
+                <w:bCs w:val="false"/>
+                <w:b w:val="false"/>
                 <w:color w:val="000000"/>
                 <w:lang w:eastAsia="pt-BR"/>
-                <w:sz w:val="24"/>
-                <w:szCs w:val="24"/>
+                <w:sz w:val="20"/>
+                <w:szCs w:val="20"/>
               </w:rPr>
             </w:pPr>
           </w:p>
@@ -5106,16 +5134,16 @@
               <w:rPr>
                 <w:rFonts w:ascii="Arial" w:hAnsi="Arial" w:cs="Arial"/>
                 <w:lang w:eastAsia="pt-BR"/>
-                <w:sz w:val="24"/>
-                <w:szCs w:val="24"/>
+                <w:sz w:val="20"/>
+                <w:szCs w:val="20"/>
               </w:rPr>
             </w:pPr>
             <w:r>
               <w:rPr>
                 <w:rFonts w:ascii="Arial" w:hAnsi="Arial" w:cs="Arial"/>
                 <w:lang w:eastAsia="pt-BR"/>
-                <w:sz w:val="24"/>
-                <w:szCs w:val="24"/>
+                <w:sz w:val="20"/>
+                <w:szCs w:val="20"/>
               </w:rPr>
               <w:t xml:space="preserve">{{escopo_contratante}}</w:t>
             </w:r>
@@ -5141,8 +5169,8 @@
                 <w:rFonts w:ascii="Arial" w:hAnsi="Arial" w:cs="Arial"/>
                 <w:color w:val="000000"/>
                 <w:lang w:eastAsia="pt-BR"/>
-                <w:sz w:val="24"/>
-                <w:szCs w:val="24"/>
+                <w:sz w:val="20"/>
+                <w:szCs w:val="20"/>
               </w:rPr>
             </w:pPr>
             <w:r>
@@ -5150,8 +5178,8 @@
                 <w:rFonts w:ascii="Arial" w:hAnsi="Arial" w:cs="Arial"/>
                 <w:color w:val="000000"/>
                 <w:lang w:eastAsia="pt-BR"/>
-                <w:sz w:val="24"/>
-                <w:szCs w:val="24"/>
+                <w:sz w:val="20"/>
+                <w:szCs w:val="20"/>
               </w:rPr>
               <w:t xml:space="preserve">{{nota_contratante}}</w:t>
             </w:r>
@@ -5167,8 +5195,8 @@
         <w:jc w:val="both"/>
         <w:rPr>
           <w:rFonts w:ascii="Arial" w:hAnsi="Arial" w:cs="Arial"/>
-          <w:sz w:val="24"/>
-          <w:szCs w:val="24"/>
+          <w:sz w:val="20"/>
+          <w:szCs w:val="20"/>
           <w:b w:val="true"/>
           <w:bCs w:val="true"/>
         </w:rPr>
@@ -5179,8 +5207,8 @@
           <w:rFonts w:ascii="Arial" w:hAnsi="Arial" w:cs="Arial"/>
           <w:b w:val="true"/>
           <w:bCs w:val="true"/>
-          <w:sz w:val="24"/>
-          <w:szCs w:val="24"/>
+          <w:sz w:val="20"/>
+          <w:szCs w:val="20"/>
         </w:rPr>
         <w:t>- Previsão de atendimento</w:t>
       </w:r>
@@ -5189,8 +5217,8 @@
           <w:rFonts w:ascii="Arial" w:hAnsi="Arial" w:cs="Arial"/>
           <w:b w:val="true"/>
           <w:bCs w:val="true"/>
-          <w:sz w:val="24"/>
-          <w:szCs w:val="24"/>
+          <w:sz w:val="20"/>
+          <w:szCs w:val="20"/>
         </w:rPr>
         <w:t>:</w:t>
       </w:r>
@@ -5207,44 +5235,50 @@
         <w:jc w:val="both"/>
         <w:rPr>
           <w:rFonts w:ascii="Arial" w:hAnsi="Arial" w:cs="Arial"/>
-          <w:sz w:val="24"/>
-          <w:szCs w:val="24"/>
-        </w:rPr>
-      </w:pPr>
-      <w:r>
-        <w:rPr>
-          <w:rFonts w:ascii="Arial" w:hAnsi="Arial" w:cs="Arial"/>
-          <w:sz w:val="24"/>
-          <w:szCs w:val="24"/>
+          <w:bCs w:val="false"/>
+          <w:b w:val="false"/>
+          <w:sz w:val="20"/>
+          <w:szCs w:val="20"/>
+        </w:rPr>
+      </w:pPr>
+      <w:r>
+        <w:rPr>
+          <w:rFonts w:ascii="Arial" w:hAnsi="Arial" w:cs="Arial"/>
+          <w:bCs w:val="false"/>
+          <w:b w:val="false"/>
+          <w:sz w:val="20"/>
+          <w:szCs w:val="20"/>
         </w:rPr>
         <w:t xml:space="preserve">- </w:t>
       </w:r>
       <w:r>
         <w:rPr>
           <w:rFonts w:ascii="Arial" w:hAnsi="Arial" w:cs="Arial"/>
-          <w:b/>
-          <w:bCs/>
+          <w:b w:val="false"/>
+          <w:bCs w:val="false"/>
           <w:noProof/>
-          <w:sz w:val="24"/>
-          <w:szCs w:val="24"/>
+          <w:sz w:val="20"/>
+          <w:szCs w:val="20"/>
         </w:rPr>
         <w:t>{{prev_atende}}</w:t>
       </w:r>
       <w:r>
         <w:rPr>
           <w:rFonts w:ascii="Arial" w:hAnsi="Arial" w:cs="Arial"/>
-          <w:b/>
-          <w:bCs/>
-          <w:sz w:val="24"/>
-          <w:szCs w:val="24"/>
+          <w:b w:val="false"/>
+          <w:bCs w:val="false"/>
+          <w:sz w:val="20"/>
+          <w:szCs w:val="20"/>
         </w:rPr>
         <w:t xml:space="preserve"> dias </w:t>
       </w:r>
       <w:r>
         <w:rPr>
           <w:rFonts w:ascii="Arial" w:hAnsi="Arial" w:cs="Arial"/>
-          <w:sz w:val="24"/>
-          <w:szCs w:val="24"/>
+          <w:bCs w:val="false"/>
+          <w:b w:val="false"/>
+          <w:sz w:val="20"/>
+          <w:szCs w:val="20"/>
         </w:rPr>
         <w:t>após o recebimento do pedido de compras ou assinatura do contrato.</w:t>
       </w:r>
@@ -5260,15 +5294,19 @@
         <w:jc w:val="both"/>
         <w:rPr>
           <w:rFonts w:ascii="Arial" w:hAnsi="Arial" w:cs="Arial"/>
-          <w:sz w:val="24"/>
-          <w:szCs w:val="24"/>
-        </w:rPr>
-      </w:pPr>
-      <w:r>
-        <w:rPr>
-          <w:rFonts w:ascii="Arial" w:hAnsi="Arial" w:cs="Arial"/>
-          <w:sz w:val="24"/>
-          <w:szCs w:val="24"/>
+          <w:bCs w:val="false"/>
+          <w:b w:val="false"/>
+          <w:sz w:val="20"/>
+          <w:szCs w:val="20"/>
+        </w:rPr>
+      </w:pPr>
+      <w:r>
+        <w:rPr>
+          <w:rFonts w:ascii="Arial" w:hAnsi="Arial" w:cs="Arial"/>
+          <w:bCs w:val="false"/>
+          <w:b w:val="false"/>
+          <w:sz w:val="20"/>
+          <w:szCs w:val="20"/>
         </w:rPr>
         <w:lastRenderedPageBreak/>
         <w:t>Nos casos em que o contrato for firmado entre a Filtrovali e a montadora, porém o faturamento ocorrer diretamente para o Cliente Final, a mobilização ficará condicionada à emissão do pedido de compra pelo Cliente Final</w:t>
@@ -5276,8 +5314,10 @@
       <w:r>
         <w:rPr>
           <w:rFonts w:ascii="Arial" w:hAnsi="Arial" w:cs="Arial"/>
-          <w:sz w:val="24"/>
-          <w:szCs w:val="24"/>
+          <w:bCs w:val="false"/>
+          <w:b w:val="false"/>
+          <w:sz w:val="20"/>
+          <w:szCs w:val="20"/>
         </w:rPr>
         <w:t>;</w:t>
       </w:r>
@@ -5293,15 +5333,19 @@
         <w:jc w:val="both"/>
         <w:rPr>
           <w:rFonts w:ascii="Arial" w:hAnsi="Arial" w:cs="Arial"/>
-          <w:sz w:val="24"/>
-          <w:szCs w:val="24"/>
-        </w:rPr>
-      </w:pPr>
-      <w:r>
-        <w:rPr>
-          <w:rFonts w:ascii="Arial" w:hAnsi="Arial" w:cs="Arial"/>
-          <w:sz w:val="24"/>
-          <w:szCs w:val="24"/>
+          <w:bCs w:val="false"/>
+          <w:b w:val="false"/>
+          <w:sz w:val="20"/>
+          <w:szCs w:val="20"/>
+        </w:rPr>
+      </w:pPr>
+      <w:r>
+        <w:rPr>
+          <w:rFonts w:ascii="Arial" w:hAnsi="Arial" w:cs="Arial"/>
+          <w:bCs w:val="false"/>
+          <w:b w:val="false"/>
+          <w:sz w:val="20"/>
+          <w:szCs w:val="20"/>
         </w:rPr>
         <w:t xml:space="preserve">O texto acima deve ser válido a cada mudança de data para atendimento.  </w:t>
       </w:r>
@@ -5313,8 +5357,8 @@
         <w:jc w:val="both"/>
         <w:rPr>
           <w:rFonts w:ascii="Arial" w:hAnsi="Arial" w:cs="Arial"/>
-          <w:sz w:val="24"/>
-          <w:szCs w:val="24"/>
+          <w:sz w:val="20"/>
+          <w:szCs w:val="20"/>
           <w:b w:val="true"/>
           <w:bCs w:val="true"/>
         </w:rPr>
@@ -5325,8 +5369,8 @@
           <w:rFonts w:ascii="Arial" w:hAnsi="Arial" w:cs="Arial"/>
           <w:b w:val="true"/>
           <w:bCs w:val="true"/>
-          <w:sz w:val="24"/>
-          <w:szCs w:val="24"/>
+          <w:sz w:val="20"/>
+          <w:szCs w:val="20"/>
         </w:rPr>
         <w:t>- Prazo para execução dos serviços:</w:t>
       </w:r>
@@ -5340,15 +5384,15 @@
         <w:jc w:val="both"/>
         <w:rPr>
           <w:rFonts w:ascii="Arial" w:hAnsi="Arial" w:cs="Arial"/>
-          <w:sz w:val="24"/>
-          <w:szCs w:val="24"/>
-        </w:rPr>
-      </w:pPr>
-      <w:r>
-        <w:rPr>
-          <w:rFonts w:ascii="Arial" w:hAnsi="Arial" w:cs="Arial"/>
-          <w:sz w:val="24"/>
-          <w:szCs w:val="24"/>
+          <w:sz w:val="20"/>
+          <w:szCs w:val="20"/>
+        </w:rPr>
+      </w:pPr>
+      <w:r>
+        <w:rPr>
+          <w:rFonts w:ascii="Arial" w:hAnsi="Arial" w:cs="Arial"/>
+          <w:sz w:val="20"/>
+          <w:szCs w:val="20"/>
         </w:rPr>
         <w:t>O cronograma apresentado leva em consideração a disponibilidade de todas as frentes de serviço prontas e liberadas para a equipe Filtrovali. É importante ressaltar que qualquer indisponibilidade das frentes de serviço para a equipe da Filtrovali poderá resultar em alterações no cronograma.</w:t>
       </w:r>
@@ -5360,19 +5404,19 @@
         <w:jc w:val="both"/>
         <w:rPr>
           <w:rFonts w:ascii="Arial" w:hAnsi="Arial" w:cs="Arial"/>
-          <w:sz w:val="24"/>
-          <w:szCs w:val="24"/>
-          <w:b w:val="true"/>
-          <w:bCs w:val="true"/>
-        </w:rPr>
-      </w:pPr>
-      <w:r>
-        <w:rPr>
-          <w:rFonts w:ascii="Arial" w:hAnsi="Arial" w:cs="Arial"/>
-          <w:sz w:val="24"/>
-          <w:szCs w:val="24"/>
-          <w:b w:val="true"/>
-          <w:bCs w:val="true"/>
+          <w:sz w:val="20"/>
+          <w:szCs w:val="20"/>
+          <w:b w:val="false"/>
+          <w:bCs w:val="false"/>
+        </w:rPr>
+      </w:pPr>
+      <w:r>
+        <w:rPr>
+          <w:rFonts w:ascii="Arial" w:hAnsi="Arial" w:cs="Arial"/>
+          <w:sz w:val="20"/>
+          <w:szCs w:val="20"/>
+          <w:b w:val="false"/>
+          <w:bCs w:val="false"/>
         </w:rPr>
         <w:t xml:space="preserve">Prazo previsto de permanência em obra (dias corridos) – </w:t>
       </w:r>
@@ -5380,20 +5424,20 @@
         <w:rPr>
           <w:rFonts w:ascii="Arial" w:hAnsi="Arial" w:cs="Arial"/>
           <w:noProof/>
-          <w:sz w:val="24"/>
-          <w:szCs w:val="24"/>
-          <w:b w:val="true"/>
-          <w:bCs w:val="true"/>
+          <w:sz w:val="20"/>
+          <w:szCs w:val="20"/>
+          <w:b w:val="false"/>
+          <w:bCs w:val="false"/>
         </w:rPr>
         <w:t>{{n_dias}}</w:t>
       </w:r>
       <w:r>
         <w:rPr>
           <w:rFonts w:ascii="Arial" w:hAnsi="Arial" w:cs="Arial"/>
-          <w:sz w:val="24"/>
-          <w:szCs w:val="24"/>
-          <w:b w:val="true"/>
-          <w:bCs w:val="true"/>
+          <w:sz w:val="20"/>
+          <w:szCs w:val="20"/>
+          <w:b w:val="false"/>
+          <w:bCs w:val="false"/>
         </w:rPr>
         <w:t xml:space="preserve"> dia(s);</w:t>
       </w:r>
@@ -5405,19 +5449,19 @@
         <w:jc w:val="both"/>
         <w:rPr>
           <w:rFonts w:ascii="Arial" w:hAnsi="Arial" w:cs="Arial"/>
-          <w:sz w:val="24"/>
-          <w:szCs w:val="24"/>
-          <w:b w:val="true"/>
-          <w:bCs w:val="true"/>
-        </w:rPr>
-      </w:pPr>
-      <w:r>
-        <w:rPr>
-          <w:rFonts w:ascii="Arial" w:hAnsi="Arial" w:cs="Arial"/>
-          <w:sz w:val="24"/>
-          <w:szCs w:val="24"/>
-          <w:b w:val="true"/>
-          <w:bCs w:val="true"/>
+          <w:sz w:val="20"/>
+          <w:szCs w:val="20"/>
+          <w:b w:val="false"/>
+          <w:bCs w:val="false"/>
+        </w:rPr>
+      </w:pPr>
+      <w:r>
+        <w:rPr>
+          <w:rFonts w:ascii="Arial" w:hAnsi="Arial" w:cs="Arial"/>
+          <w:sz w:val="20"/>
+          <w:szCs w:val="20"/>
+          <w:b w:val="false"/>
+          <w:bCs w:val="false"/>
         </w:rPr>
         <w:t xml:space="preserve">Prazo previsto para integração – </w:t>
       </w:r>
@@ -5425,20 +5469,20 @@
         <w:rPr>
           <w:rFonts w:ascii="Arial" w:hAnsi="Arial" w:cs="Arial"/>
           <w:noProof/>
-          <w:sz w:val="24"/>
-          <w:szCs w:val="24"/>
-          <w:b w:val="true"/>
-          <w:bCs w:val="true"/>
+          <w:sz w:val="20"/>
+          <w:szCs w:val="20"/>
+          <w:b w:val="false"/>
+          <w:bCs w:val="false"/>
         </w:rPr>
         <w:t>{{dias_treinamento}}</w:t>
       </w:r>
       <w:r>
         <w:rPr>
           <w:rFonts w:ascii="Arial" w:hAnsi="Arial" w:cs="Arial"/>
-          <w:sz w:val="24"/>
-          <w:szCs w:val="24"/>
-          <w:b w:val="true"/>
-          <w:bCs w:val="true"/>
+          <w:sz w:val="20"/>
+          <w:szCs w:val="20"/>
+          <w:b w:val="false"/>
+          <w:bCs w:val="false"/>
         </w:rPr>
         <w:t xml:space="preserve"> dia(s);</w:t>
       </w:r>
@@ -5450,19 +5494,19 @@
         <w:jc w:val="both"/>
         <w:rPr>
           <w:rFonts w:ascii="Arial" w:hAnsi="Arial" w:cs="Arial"/>
-          <w:sz w:val="24"/>
-          <w:szCs w:val="24"/>
-          <w:b w:val="true"/>
-          <w:bCs w:val="true"/>
-        </w:rPr>
-      </w:pPr>
-      <w:r>
-        <w:rPr>
-          <w:rFonts w:ascii="Arial" w:hAnsi="Arial" w:cs="Arial"/>
-          <w:sz w:val="24"/>
-          <w:szCs w:val="24"/>
-          <w:b w:val="true"/>
-          <w:bCs w:val="true"/>
+          <w:sz w:val="20"/>
+          <w:szCs w:val="20"/>
+          <w:b w:val="false"/>
+          <w:bCs w:val="false"/>
+        </w:rPr>
+      </w:pPr>
+      <w:r>
+        <w:rPr>
+          <w:rFonts w:ascii="Arial" w:hAnsi="Arial" w:cs="Arial"/>
+          <w:sz w:val="20"/>
+          <w:szCs w:val="20"/>
+          <w:b w:val="false"/>
+          <w:bCs w:val="false"/>
         </w:rPr>
         <w:t xml:space="preserve">Prazo previsto de execução dos serviços (dias trabalhados/uteis) – </w:t>
       </w:r>
@@ -5470,20 +5514,20 @@
         <w:rPr>
           <w:rFonts w:ascii="Arial" w:hAnsi="Arial" w:cs="Arial"/>
           <w:noProof/>
-          <w:sz w:val="24"/>
-          <w:szCs w:val="24"/>
-          <w:b w:val="true"/>
-          <w:bCs w:val="true"/>
+          <w:sz w:val="20"/>
+          <w:szCs w:val="20"/>
+          <w:b w:val="false"/>
+          <w:bCs w:val="false"/>
         </w:rPr>
         <w:t>{{n_dias_trabalhados}}</w:t>
       </w:r>
       <w:r>
         <w:rPr>
           <w:rFonts w:ascii="Arial" w:hAnsi="Arial" w:cs="Arial"/>
-          <w:sz w:val="24"/>
-          <w:szCs w:val="24"/>
-          <w:b w:val="true"/>
-          <w:bCs w:val="true"/>
+          <w:sz w:val="20"/>
+          <w:szCs w:val="20"/>
+          <w:b w:val="false"/>
+          <w:bCs w:val="false"/>
         </w:rPr>
         <w:t xml:space="preserve"> dia(as)</w:t>
       </w:r>
@@ -5495,19 +5539,19 @@
         <w:jc w:val="both"/>
         <w:rPr>
           <w:rFonts w:ascii="Arial" w:hAnsi="Arial" w:cs="Arial"/>
-          <w:sz w:val="24"/>
-          <w:szCs w:val="24"/>
-          <w:b w:val="true"/>
-          <w:bCs w:val="true"/>
-        </w:rPr>
-      </w:pPr>
-      <w:r>
-        <w:rPr>
-          <w:rFonts w:ascii="Arial" w:hAnsi="Arial" w:cs="Arial"/>
-          <w:sz w:val="24"/>
-          <w:szCs w:val="24"/>
-          <w:b w:val="true"/>
-          <w:bCs w:val="true"/>
+          <w:sz w:val="20"/>
+          <w:szCs w:val="20"/>
+          <w:b w:val="false"/>
+          <w:bCs w:val="false"/>
+        </w:rPr>
+      </w:pPr>
+      <w:r>
+        <w:rPr>
+          <w:rFonts w:ascii="Arial" w:hAnsi="Arial" w:cs="Arial"/>
+          <w:sz w:val="20"/>
+          <w:szCs w:val="20"/>
+          <w:b w:val="false"/>
+          <w:bCs w:val="false"/>
         </w:rPr>
         <w:t xml:space="preserve">Prazo de deslocamento (Mob/desmob) – </w:t>
       </w:r>
@@ -5515,20 +5559,20 @@
         <w:rPr>
           <w:rFonts w:ascii="Arial" w:hAnsi="Arial" w:cs="Arial"/>
           <w:noProof/>
-          <w:sz w:val="24"/>
-          <w:szCs w:val="24"/>
-          <w:b w:val="true"/>
-          <w:bCs w:val="true"/>
+          <w:sz w:val="20"/>
+          <w:szCs w:val="20"/>
+          <w:b w:val="false"/>
+          <w:bCs w:val="false"/>
         </w:rPr>
         <w:t>{{dias_mob}}</w:t>
       </w:r>
       <w:r>
         <w:rPr>
           <w:rFonts w:ascii="Arial" w:hAnsi="Arial" w:cs="Arial"/>
-          <w:sz w:val="24"/>
-          <w:szCs w:val="24"/>
-          <w:b w:val="true"/>
-          <w:bCs w:val="true"/>
+          <w:sz w:val="20"/>
+          <w:szCs w:val="20"/>
+          <w:b w:val="false"/>
+          <w:bCs w:val="false"/>
         </w:rPr>
         <w:t xml:space="preserve"> dia(s).</w:t>
       </w:r>
@@ -5540,15 +5584,15 @@
         <w:jc w:val="both"/>
         <w:rPr>
           <w:rFonts w:ascii="Arial" w:hAnsi="Arial" w:cs="Arial"/>
-          <w:sz w:val="24"/>
-          <w:szCs w:val="24"/>
-        </w:rPr>
-      </w:pPr>
-      <w:r>
-        <w:rPr>
-          <w:rFonts w:ascii="Arial" w:hAnsi="Arial" w:cs="Arial"/>
-          <w:sz w:val="24"/>
-          <w:szCs w:val="24"/>
+          <w:sz w:val="20"/>
+          <w:szCs w:val="20"/>
+        </w:rPr>
+      </w:pPr>
+      <w:r>
+        <w:rPr>
+          <w:rFonts w:ascii="Arial" w:hAnsi="Arial" w:cs="Arial"/>
+          <w:sz w:val="20"/>
+          <w:szCs w:val="20"/>
         </w:rPr>
         <w:t>NOTA: O prazo de deslocamento não está incluso ao prazo previsto de permanência em obra.</w:t>
       </w:r>
@@ -5560,8 +5604,8 @@
         <w:jc w:val="both"/>
         <w:rPr>
           <w:rFonts w:ascii="Arial" w:hAnsi="Arial" w:cs="Arial"/>
-          <w:sz w:val="24"/>
-          <w:szCs w:val="24"/>
+          <w:sz w:val="20"/>
+          <w:szCs w:val="20"/>
           <w:b w:val="true"/>
           <w:bCs w:val="true"/>
         </w:rPr>
@@ -5572,8 +5616,8 @@
           <w:rFonts w:ascii="Arial" w:hAnsi="Arial" w:cs="Arial"/>
           <w:b w:val="true"/>
           <w:bCs w:val="true"/>
-          <w:sz w:val="24"/>
-          <w:szCs w:val="24"/>
+          <w:sz w:val="20"/>
+          <w:szCs w:val="20"/>
         </w:rPr>
         <w:t>- Jornada de trabalho:</w:t>
       </w:r>
@@ -5587,15 +5631,15 @@
         <w:jc w:val="both"/>
         <w:rPr>
           <w:rFonts w:ascii="Arial" w:hAnsi="Arial" w:cs="Arial"/>
-          <w:sz w:val="24"/>
-          <w:szCs w:val="24"/>
-        </w:rPr>
-      </w:pPr>
-      <w:r>
-        <w:rPr>
-          <w:rFonts w:ascii="Arial" w:hAnsi="Arial" w:cs="Arial"/>
-          <w:sz w:val="24"/>
-          <w:szCs w:val="24"/>
+          <w:sz w:val="20"/>
+          <w:szCs w:val="20"/>
+        </w:rPr>
+      </w:pPr>
+      <w:r>
+        <w:rPr>
+          <w:rFonts w:ascii="Arial" w:hAnsi="Arial" w:cs="Arial"/>
+          <w:sz w:val="20"/>
+          <w:szCs w:val="20"/>
         </w:rPr>
         <w:t xml:space="preserve">O horário de entrada e saída das equipes em obra é flexível podendo se adaptar ao horário do projeto em questão, desde que não ultrapasse 44 horas semanais conforme normas previstas na CLT. </w:t>
       </w:r>
@@ -5607,19 +5651,19 @@
         <w:jc w:val="both"/>
         <w:rPr>
           <w:rFonts w:ascii="Arial" w:hAnsi="Arial" w:cs="Arial"/>
-          <w:sz w:val="24"/>
-          <w:szCs w:val="24"/>
-          <w:b w:val="true"/>
-          <w:bCs w:val="true"/>
-        </w:rPr>
-      </w:pPr>
-      <w:r>
-        <w:rPr>
-          <w:rFonts w:ascii="Arial" w:hAnsi="Arial" w:cs="Arial"/>
-          <w:sz w:val="24"/>
-          <w:szCs w:val="24"/>
-          <w:b w:val="true"/>
-          <w:bCs w:val="true"/>
+          <w:sz w:val="20"/>
+          <w:szCs w:val="20"/>
+          <w:b w:val="false"/>
+          <w:bCs w:val="false"/>
+        </w:rPr>
+      </w:pPr>
+      <w:r>
+        <w:rPr>
+          <w:rFonts w:ascii="Arial" w:hAnsi="Arial" w:cs="Arial"/>
+          <w:sz w:val="20"/>
+          <w:szCs w:val="20"/>
+          <w:b w:val="false"/>
+          <w:bCs w:val="false"/>
         </w:rPr>
         <w:t>Turno diurno:</w:t>
       </w:r>
@@ -5635,15 +5679,19 @@
         <w:jc w:val="both"/>
         <w:rPr>
           <w:rFonts w:ascii="Arial" w:hAnsi="Arial" w:cs="Arial"/>
-          <w:sz w:val="24"/>
-          <w:szCs w:val="24"/>
-        </w:rPr>
-      </w:pPr>
-      <w:r>
-        <w:rPr>
-          <w:rFonts w:ascii="Arial" w:hAnsi="Arial" w:cs="Arial"/>
-          <w:sz w:val="24"/>
-          <w:szCs w:val="24"/>
+          <w:bCs w:val="false"/>
+          <w:b w:val="false"/>
+          <w:sz w:val="20"/>
+          <w:szCs w:val="20"/>
+        </w:rPr>
+      </w:pPr>
+      <w:r>
+        <w:rPr>
+          <w:rFonts w:ascii="Arial" w:hAnsi="Arial" w:cs="Arial"/>
+          <w:bCs w:val="false"/>
+          <w:b w:val="false"/>
+          <w:sz w:val="20"/>
+          <w:szCs w:val="20"/>
         </w:rPr>
         <w:t>Segunda a quinta feira – 9 horas trabalhadas – 1 hora de intervalo para almoço</w:t>
       </w:r>
@@ -5659,15 +5707,19 @@
         <w:jc w:val="both"/>
         <w:rPr>
           <w:rFonts w:ascii="Arial" w:hAnsi="Arial" w:cs="Arial"/>
-          <w:sz w:val="24"/>
-          <w:szCs w:val="24"/>
-        </w:rPr>
-      </w:pPr>
-      <w:r>
-        <w:rPr>
-          <w:rFonts w:ascii="Arial" w:hAnsi="Arial" w:cs="Arial"/>
-          <w:sz w:val="24"/>
-          <w:szCs w:val="24"/>
+          <w:bCs w:val="false"/>
+          <w:b w:val="false"/>
+          <w:sz w:val="20"/>
+          <w:szCs w:val="20"/>
+        </w:rPr>
+      </w:pPr>
+      <w:r>
+        <w:rPr>
+          <w:rFonts w:ascii="Arial" w:hAnsi="Arial" w:cs="Arial"/>
+          <w:bCs w:val="false"/>
+          <w:b w:val="false"/>
+          <w:sz w:val="20"/>
+          <w:szCs w:val="20"/>
         </w:rPr>
         <w:t>Sexta feira – 8 horas trabalhadas – 1 hora de intervalo para almoço</w:t>
       </w:r>
@@ -5679,15 +5731,15 @@
         <w:jc w:val="both"/>
         <w:rPr>
           <w:rFonts w:ascii="Arial" w:hAnsi="Arial" w:cs="Arial"/>
-          <w:sz w:val="24"/>
-          <w:szCs w:val="24"/>
-        </w:rPr>
-      </w:pPr>
-      <w:r>
-        <w:rPr>
-          <w:rFonts w:ascii="Arial" w:hAnsi="Arial" w:cs="Arial"/>
-          <w:sz w:val="24"/>
-          <w:szCs w:val="24"/>
+          <w:sz w:val="20"/>
+          <w:szCs w:val="20"/>
+        </w:rPr>
+      </w:pPr>
+      <w:r>
+        <w:rPr>
+          <w:rFonts w:ascii="Arial" w:hAnsi="Arial" w:cs="Arial"/>
+          <w:sz w:val="20"/>
+          <w:szCs w:val="20"/>
         </w:rPr>
         <w:t xml:space="preserve">Notas: Os trabalhos em horas extras (sábados, domingos, feriados e além do previsto no item 6.1) poderão ser executados quando solicitado pela Contratante. Será feito o registro em RDO, indicado no campo Horas Extras e lançado na medição como adicional. </w:t>
       </w:r>
@@ -5699,8 +5751,8 @@
         <w:jc w:val="both"/>
         <w:rPr>
           <w:rFonts w:ascii="Arial" w:hAnsi="Arial" w:cs="Arial"/>
-          <w:sz w:val="24"/>
-          <w:szCs w:val="24"/>
+          <w:sz w:val="20"/>
+          <w:szCs w:val="20"/>
           <w:b w:val="true"/>
           <w:bCs w:val="true"/>
         </w:rPr>
@@ -5710,8 +5762,8 @@
         <w:rPr>
           <w:rFonts w:ascii="Arial" w:hAnsi="Arial" w:cs="Arial"/>
           <w:b w:val="true"/>
-          <w:sz w:val="24"/>
-          <w:szCs w:val="24"/>
+          <w:sz w:val="20"/>
+          <w:szCs w:val="20"/>
           <w:bCs w:val="true"/>
         </w:rPr>
         <w:t>- Escopo Técnico:</w:t>
@@ -5725,8 +5777,8 @@
         <w:jc w:val="both"/>
         <w:rPr>
           <w:rFonts w:ascii="Arial" w:hAnsi="Arial" w:cs="Arial"/>
-          <w:sz w:val="24"/>
-          <w:szCs w:val="24"/>
+          <w:sz w:val="20"/>
+          <w:szCs w:val="20"/>
           <w:b w:val="true"/>
           <w:bCs w:val="true"/>
         </w:rPr>
@@ -5736,8 +5788,8 @@
         <w:rPr>
           <w:rFonts w:ascii="Arial" w:hAnsi="Arial" w:cs="Arial"/>
           <w:b w:val="true"/>
-          <w:sz w:val="24"/>
-          <w:szCs w:val="24"/>
+          <w:sz w:val="20"/>
+          <w:szCs w:val="20"/>
           <w:bCs w:val="true"/>
         </w:rPr>
         <w:t>- Relatórios:</w:t>
@@ -5758,33 +5810,39 @@
         <w:jc w:val="both"/>
         <w:rPr>
           <w:rFonts w:ascii="Arial" w:hAnsi="Arial" w:cs="Arial"/>
-          <w:sz w:val="24"/>
-          <w:szCs w:val="24"/>
-        </w:rPr>
-      </w:pPr>
-      <w:r>
-        <w:rPr>
-          <w:rFonts w:ascii="Arial" w:hAnsi="Arial" w:cs="Arial"/>
-          <w:sz w:val="24"/>
-          <w:szCs w:val="24"/>
+          <w:bCs w:val="false"/>
+          <w:b w:val="false"/>
+          <w:sz w:val="20"/>
+          <w:szCs w:val="20"/>
+        </w:rPr>
+      </w:pPr>
+      <w:r>
+        <w:rPr>
+          <w:rFonts w:ascii="Arial" w:hAnsi="Arial" w:cs="Arial"/>
+          <w:bCs w:val="false"/>
+          <w:b w:val="false"/>
+          <w:sz w:val="20"/>
+          <w:szCs w:val="20"/>
         </w:rPr>
         <w:t xml:space="preserve">Será entregue diariamente o </w:t>
       </w:r>
       <w:r>
         <w:rPr>
           <w:rFonts w:ascii="Arial" w:hAnsi="Arial" w:cs="Arial"/>
-          <w:b/>
-          <w:bCs/>
-          <w:sz w:val="24"/>
-          <w:szCs w:val="24"/>
+          <w:b w:val="false"/>
+          <w:bCs w:val="false"/>
+          <w:sz w:val="20"/>
+          <w:szCs w:val="20"/>
         </w:rPr>
         <w:t xml:space="preserve">RDO </w:t>
       </w:r>
       <w:r>
         <w:rPr>
           <w:rFonts w:ascii="Arial" w:hAnsi="Arial" w:cs="Arial"/>
-          <w:sz w:val="24"/>
-          <w:szCs w:val="24"/>
+          <w:bCs w:val="false"/>
+          <w:b w:val="false"/>
+          <w:sz w:val="20"/>
+          <w:szCs w:val="20"/>
         </w:rPr>
         <w:t>(relatório diário de obra) descrevendo quais serviços foram executados referente ao dia de trabalho;</w:t>
       </w:r>
@@ -5799,15 +5857,15 @@
         <w:jc w:val="both"/>
         <w:rPr>
           <w:rFonts w:ascii="Arial" w:hAnsi="Arial" w:cs="Arial"/>
-          <w:sz w:val="24"/>
-          <w:szCs w:val="24"/>
-        </w:rPr>
-      </w:pPr>
-      <w:r>
-        <w:rPr>
-          <w:rFonts w:ascii="Arial" w:hAnsi="Arial" w:cs="Arial"/>
-          <w:sz w:val="24"/>
-          <w:szCs w:val="24"/>
+          <w:sz w:val="20"/>
+          <w:szCs w:val="20"/>
+        </w:rPr>
+      </w:pPr>
+      <w:r>
+        <w:rPr>
+          <w:rFonts w:ascii="Arial" w:hAnsi="Arial" w:cs="Arial"/>
+          <w:sz w:val="20"/>
+          <w:szCs w:val="20"/>
         </w:rPr>
         <w:lastRenderedPageBreak/>
         <w:t>Obs: Visando a redução de tempo e retrabalho com manutenção de relatórios, os relatórios abaixo só serão elaborados e entregues após a regularização e aprovação dos RDOs.</w:t>
@@ -5827,33 +5885,39 @@
         <w:jc w:val="both"/>
         <w:rPr>
           <w:rFonts w:ascii="Arial" w:hAnsi="Arial" w:cs="Arial"/>
-          <w:sz w:val="24"/>
-          <w:szCs w:val="24"/>
-        </w:rPr>
-      </w:pPr>
-      <w:r>
-        <w:rPr>
-          <w:rFonts w:ascii="Arial" w:hAnsi="Arial" w:cs="Arial"/>
-          <w:sz w:val="24"/>
-          <w:szCs w:val="24"/>
+          <w:bCs w:val="false"/>
+          <w:b w:val="false"/>
+          <w:sz w:val="20"/>
+          <w:szCs w:val="20"/>
+        </w:rPr>
+      </w:pPr>
+      <w:r>
+        <w:rPr>
+          <w:rFonts w:ascii="Arial" w:hAnsi="Arial" w:cs="Arial"/>
+          <w:bCs w:val="false"/>
+          <w:b w:val="false"/>
+          <w:sz w:val="20"/>
+          <w:szCs w:val="20"/>
         </w:rPr>
         <w:t xml:space="preserve">Após a conclusão dos serviços de limpeza química será emitido um </w:t>
       </w:r>
       <w:r>
         <w:rPr>
           <w:rFonts w:ascii="Arial" w:hAnsi="Arial" w:cs="Arial"/>
-          <w:b/>
-          <w:bCs/>
-          <w:sz w:val="24"/>
-          <w:szCs w:val="24"/>
+          <w:b w:val="false"/>
+          <w:bCs w:val="false"/>
+          <w:sz w:val="20"/>
+          <w:szCs w:val="20"/>
         </w:rPr>
         <w:t>RLQ</w:t>
       </w:r>
       <w:r>
         <w:rPr>
           <w:rFonts w:ascii="Arial" w:hAnsi="Arial" w:cs="Arial"/>
-          <w:sz w:val="24"/>
-          <w:szCs w:val="24"/>
+          <w:bCs w:val="false"/>
+          <w:b w:val="false"/>
+          <w:sz w:val="20"/>
+          <w:szCs w:val="20"/>
         </w:rPr>
         <w:t xml:space="preserve"> (relatório de limpeza química) com os registros fotográficos da tubulação, este relatório será encaminhado ao responsável pela fiscalização para aceitação dos serviços;</w:t>
       </w:r>
@@ -5872,33 +5936,39 @@
         <w:jc w:val="both"/>
         <w:rPr>
           <w:rFonts w:ascii="Arial" w:hAnsi="Arial" w:cs="Arial"/>
-          <w:sz w:val="24"/>
-          <w:szCs w:val="24"/>
-        </w:rPr>
-      </w:pPr>
-      <w:r>
-        <w:rPr>
-          <w:rFonts w:ascii="Arial" w:hAnsi="Arial" w:cs="Arial"/>
-          <w:sz w:val="24"/>
-          <w:szCs w:val="24"/>
+          <w:bCs w:val="false"/>
+          <w:b w:val="false"/>
+          <w:sz w:val="20"/>
+          <w:szCs w:val="20"/>
+        </w:rPr>
+      </w:pPr>
+      <w:r>
+        <w:rPr>
+          <w:rFonts w:ascii="Arial" w:hAnsi="Arial" w:cs="Arial"/>
+          <w:bCs w:val="false"/>
+          <w:b w:val="false"/>
+          <w:sz w:val="20"/>
+          <w:szCs w:val="20"/>
         </w:rPr>
         <w:t xml:space="preserve">Após a conclusão dos serviços de flushing e/ou filtragem absoluta, será emitido </w:t>
       </w:r>
       <w:r>
         <w:rPr>
           <w:rFonts w:ascii="Arial" w:hAnsi="Arial" w:cs="Arial"/>
-          <w:b/>
-          <w:bCs/>
-          <w:sz w:val="24"/>
-          <w:szCs w:val="24"/>
+          <w:b w:val="false"/>
+          <w:bCs w:val="false"/>
+          <w:sz w:val="20"/>
+          <w:szCs w:val="20"/>
         </w:rPr>
         <w:t>RCPU</w:t>
       </w:r>
       <w:r>
         <w:rPr>
           <w:rFonts w:ascii="Arial" w:hAnsi="Arial" w:cs="Arial"/>
-          <w:sz w:val="24"/>
-          <w:szCs w:val="24"/>
+          <w:bCs w:val="false"/>
+          <w:b w:val="false"/>
+          <w:sz w:val="20"/>
+          <w:szCs w:val="20"/>
         </w:rPr>
         <w:t xml:space="preserve"> (relatório de contagem de partículas e umidade) com os registros de contagem de partículas inicial e final, este será encaminhado ao responsável pela fiscalização para aceitação dos serviços;</w:t>
       </w:r>
@@ -5917,33 +5987,39 @@
         <w:jc w:val="both"/>
         <w:rPr>
           <w:rFonts w:ascii="Arial" w:hAnsi="Arial" w:cs="Arial"/>
-          <w:sz w:val="24"/>
-          <w:szCs w:val="24"/>
-        </w:rPr>
-      </w:pPr>
-      <w:r>
-        <w:rPr>
-          <w:rFonts w:ascii="Arial" w:hAnsi="Arial" w:cs="Arial"/>
-          <w:sz w:val="24"/>
-          <w:szCs w:val="24"/>
+          <w:bCs w:val="false"/>
+          <w:b w:val="false"/>
+          <w:sz w:val="20"/>
+          <w:szCs w:val="20"/>
+        </w:rPr>
+      </w:pPr>
+      <w:r>
+        <w:rPr>
+          <w:rFonts w:ascii="Arial" w:hAnsi="Arial" w:cs="Arial"/>
+          <w:bCs w:val="false"/>
+          <w:b w:val="false"/>
+          <w:sz w:val="20"/>
+          <w:szCs w:val="20"/>
         </w:rPr>
         <w:t xml:space="preserve">Após a conclusão do teste hidrostático será emitido um </w:t>
       </w:r>
       <w:r>
         <w:rPr>
           <w:rFonts w:ascii="Arial" w:hAnsi="Arial" w:cs="Arial"/>
-          <w:b/>
-          <w:bCs/>
-          <w:sz w:val="24"/>
-          <w:szCs w:val="24"/>
+          <w:b w:val="false"/>
+          <w:bCs w:val="false"/>
+          <w:sz w:val="20"/>
+          <w:szCs w:val="20"/>
         </w:rPr>
         <w:t>RTP</w:t>
       </w:r>
       <w:r>
         <w:rPr>
           <w:rFonts w:ascii="Arial" w:hAnsi="Arial" w:cs="Arial"/>
-          <w:sz w:val="24"/>
-          <w:szCs w:val="24"/>
+          <w:bCs w:val="false"/>
+          <w:b w:val="false"/>
+          <w:sz w:val="20"/>
+          <w:szCs w:val="20"/>
         </w:rPr>
         <w:t xml:space="preserve"> (relatório de teste hidrostático) para cada sistema descrevendo as informações dos manômetros utilizados, pressão de projeto e teste, tempo de teste e fotos dos manômetros e sistema;</w:t>
       </w:r>
@@ -5962,33 +6038,39 @@
         <w:jc w:val="both"/>
         <w:rPr>
           <w:rFonts w:ascii="Arial" w:hAnsi="Arial" w:cs="Arial"/>
-          <w:sz w:val="24"/>
-          <w:szCs w:val="24"/>
-        </w:rPr>
-      </w:pPr>
-      <w:r>
-        <w:rPr>
-          <w:rFonts w:ascii="Arial" w:hAnsi="Arial" w:cs="Arial"/>
-          <w:sz w:val="24"/>
-          <w:szCs w:val="24"/>
+          <w:bCs w:val="false"/>
+          <w:b w:val="false"/>
+          <w:sz w:val="20"/>
+          <w:szCs w:val="20"/>
+        </w:rPr>
+      </w:pPr>
+      <w:r>
+        <w:rPr>
+          <w:rFonts w:ascii="Arial" w:hAnsi="Arial" w:cs="Arial"/>
+          <w:bCs w:val="false"/>
+          <w:b w:val="false"/>
+          <w:sz w:val="20"/>
+          <w:szCs w:val="20"/>
         </w:rPr>
         <w:t xml:space="preserve">Após a conclusão dos serviços de limpeza de reservatório será emitido um </w:t>
       </w:r>
       <w:r>
         <w:rPr>
           <w:rFonts w:ascii="Arial" w:hAnsi="Arial" w:cs="Arial"/>
-          <w:b/>
-          <w:bCs/>
-          <w:sz w:val="24"/>
-          <w:szCs w:val="24"/>
+          <w:b w:val="false"/>
+          <w:bCs w:val="false"/>
+          <w:sz w:val="20"/>
+          <w:szCs w:val="20"/>
         </w:rPr>
         <w:t>RLR</w:t>
       </w:r>
       <w:r>
         <w:rPr>
           <w:rFonts w:ascii="Arial" w:hAnsi="Arial" w:cs="Arial"/>
-          <w:sz w:val="24"/>
-          <w:szCs w:val="24"/>
+          <w:bCs w:val="false"/>
+          <w:b w:val="false"/>
+          <w:sz w:val="20"/>
+          <w:szCs w:val="20"/>
         </w:rPr>
         <w:t xml:space="preserve"> (relatório de limpeza de reservatório) com registros fotográficos antes e após os serviços;</w:t>
       </w:r>
@@ -6007,105 +6089,129 @@
         <w:jc w:val="both"/>
         <w:rPr>
           <w:rFonts w:ascii="Arial" w:hAnsi="Arial" w:cs="Arial"/>
-          <w:sz w:val="24"/>
-          <w:szCs w:val="24"/>
-        </w:rPr>
-      </w:pPr>
-      <w:r>
-        <w:rPr>
-          <w:rFonts w:ascii="Arial" w:hAnsi="Arial" w:cs="Arial"/>
-          <w:sz w:val="24"/>
-          <w:szCs w:val="24"/>
+          <w:bCs w:val="false"/>
+          <w:b w:val="false"/>
+          <w:sz w:val="20"/>
+          <w:szCs w:val="20"/>
+        </w:rPr>
+      </w:pPr>
+      <w:r>
+        <w:rPr>
+          <w:rFonts w:ascii="Arial" w:hAnsi="Arial" w:cs="Arial"/>
+          <w:bCs w:val="false"/>
+          <w:b w:val="false"/>
+          <w:sz w:val="20"/>
+          <w:szCs w:val="20"/>
         </w:rPr>
         <w:t>Após a conclusão do</w:t>
       </w:r>
       <w:r>
         <w:rPr>
           <w:rFonts w:ascii="Arial" w:hAnsi="Arial" w:cs="Arial"/>
-          <w:sz w:val="24"/>
-          <w:szCs w:val="24"/>
+          <w:bCs w:val="false"/>
+          <w:b w:val="false"/>
+          <w:sz w:val="20"/>
+          <w:szCs w:val="20"/>
         </w:rPr>
         <w:t>s</w:t>
       </w:r>
       <w:r>
         <w:rPr>
           <w:rFonts w:ascii="Arial" w:hAnsi="Arial" w:cs="Arial"/>
-          <w:sz w:val="24"/>
-          <w:szCs w:val="24"/>
+          <w:bCs w:val="false"/>
+          <w:b w:val="false"/>
+          <w:sz w:val="20"/>
+          <w:szCs w:val="20"/>
         </w:rPr>
         <w:t xml:space="preserve"> </w:t>
       </w:r>
       <w:r>
         <w:rPr>
           <w:rFonts w:ascii="Arial" w:hAnsi="Arial" w:cs="Arial"/>
-          <w:sz w:val="24"/>
-          <w:szCs w:val="24"/>
+          <w:bCs w:val="false"/>
+          <w:b w:val="false"/>
+          <w:sz w:val="20"/>
+          <w:szCs w:val="20"/>
         </w:rPr>
         <w:t>serviços de flushing</w:t>
       </w:r>
       <w:r>
         <w:rPr>
           <w:rFonts w:ascii="Arial" w:hAnsi="Arial" w:cs="Arial"/>
-          <w:sz w:val="24"/>
-          <w:szCs w:val="24"/>
+          <w:bCs w:val="false"/>
+          <w:b w:val="false"/>
+          <w:sz w:val="20"/>
+          <w:szCs w:val="20"/>
         </w:rPr>
         <w:t xml:space="preserve"> será emitido um </w:t>
       </w:r>
       <w:r>
         <w:rPr>
           <w:rFonts w:ascii="Arial" w:hAnsi="Arial" w:cs="Arial"/>
-          <w:b/>
-          <w:bCs/>
-          <w:sz w:val="24"/>
-          <w:szCs w:val="24"/>
+          <w:b w:val="false"/>
+          <w:bCs w:val="false"/>
+          <w:sz w:val="20"/>
+          <w:szCs w:val="20"/>
         </w:rPr>
         <w:t>RLF</w:t>
       </w:r>
       <w:r>
         <w:rPr>
           <w:rFonts w:ascii="Arial" w:hAnsi="Arial" w:cs="Arial"/>
-          <w:sz w:val="24"/>
-          <w:szCs w:val="24"/>
+          <w:bCs w:val="false"/>
+          <w:b w:val="false"/>
+          <w:sz w:val="20"/>
+          <w:szCs w:val="20"/>
         </w:rPr>
         <w:t xml:space="preserve"> (relatório </w:t>
       </w:r>
       <w:r>
         <w:rPr>
           <w:rFonts w:ascii="Arial" w:hAnsi="Arial" w:cs="Arial"/>
-          <w:sz w:val="24"/>
-          <w:szCs w:val="24"/>
+          <w:bCs w:val="false"/>
+          <w:b w:val="false"/>
+          <w:sz w:val="20"/>
+          <w:szCs w:val="20"/>
         </w:rPr>
         <w:t>de flushing</w:t>
       </w:r>
       <w:r>
         <w:rPr>
           <w:rFonts w:ascii="Arial" w:hAnsi="Arial" w:cs="Arial"/>
-          <w:sz w:val="24"/>
-          <w:szCs w:val="24"/>
+          <w:bCs w:val="false"/>
+          <w:b w:val="false"/>
+          <w:sz w:val="20"/>
+          <w:szCs w:val="20"/>
         </w:rPr>
         <w:t>)</w:t>
       </w:r>
       <w:r>
         <w:rPr>
           <w:rFonts w:ascii="Arial" w:hAnsi="Arial" w:cs="Arial"/>
-          <w:sz w:val="24"/>
-          <w:szCs w:val="24"/>
+          <w:bCs w:val="false"/>
+          <w:b w:val="false"/>
+          <w:sz w:val="20"/>
+          <w:szCs w:val="20"/>
         </w:rPr>
         <w:t xml:space="preserve"> </w:t>
       </w:r>
       <w:r>
         <w:rPr>
           <w:rFonts w:ascii="Arial" w:hAnsi="Arial" w:cs="Arial"/>
-          <w:sz w:val="24"/>
-          <w:szCs w:val="24"/>
+          <w:bCs w:val="false"/>
+          <w:b w:val="false"/>
+          <w:sz w:val="20"/>
+          <w:szCs w:val="20"/>
         </w:rPr>
         <w:t xml:space="preserve">descrevendo as informações </w:t>
       </w:r>
       <w:r>
         <w:rPr>
           <w:rFonts w:ascii="Arial" w:hAnsi="Arial" w:cs="Arial"/>
-          <w:sz w:val="24"/>
-          <w:szCs w:val="24"/>
+          <w:bCs w:val="false"/>
+          <w:b w:val="false"/>
+          <w:sz w:val="20"/>
+          <w:szCs w:val="20"/>
         </w:rPr>
         <w:t>específicas das atividades, bem como, as imagens do antes e depois de alguns pontos da estrutura.</w:t>
       </w:r>
@@ -6117,8 +6223,8 @@
         <w:jc w:val="both"/>
         <w:rPr>
           <w:rFonts w:ascii="Arial" w:hAnsi="Arial" w:cs="Arial"/>
-          <w:sz w:val="24"/>
-          <w:szCs w:val="24"/>
+          <w:sz w:val="20"/>
+          <w:szCs w:val="20"/>
           <w:b w:val="true"/>
           <w:bCs w:val="true"/>
         </w:rPr>
@@ -6129,8 +6235,8 @@
           <w:rFonts w:ascii="Arial" w:hAnsi="Arial" w:cs="Arial"/>
           <w:b w:val="true"/>
           <w:bCs w:val="true"/>
-          <w:sz w:val="24"/>
-          <w:szCs w:val="24"/>
+          <w:sz w:val="20"/>
+          <w:szCs w:val="20"/>
         </w:rPr>
         <w:t>- Validade da proposta:</w:t>
       </w:r>
@@ -6147,42 +6253,50 @@
         <w:jc w:val="both"/>
         <w:rPr>
           <w:rFonts w:ascii="Arial" w:hAnsi="Arial" w:cs="Arial"/>
-          <w:sz w:val="24"/>
-          <w:szCs w:val="24"/>
-        </w:rPr>
-      </w:pPr>
-      <w:r>
-        <w:rPr>
-          <w:rFonts w:ascii="Arial" w:hAnsi="Arial" w:cs="Arial"/>
-          <w:sz w:val="24"/>
-          <w:szCs w:val="24"/>
+          <w:bCs w:val="false"/>
+          <w:b w:val="false"/>
+          <w:sz w:val="20"/>
+          <w:szCs w:val="20"/>
+        </w:rPr>
+      </w:pPr>
+      <w:r>
+        <w:rPr>
+          <w:rFonts w:ascii="Arial" w:hAnsi="Arial" w:cs="Arial"/>
+          <w:bCs w:val="false"/>
+          <w:b w:val="false"/>
+          <w:sz w:val="20"/>
+          <w:szCs w:val="20"/>
         </w:rPr>
         <w:t xml:space="preserve">- </w:t>
       </w:r>
       <w:r>
         <w:rPr>
           <w:rFonts w:ascii="Arial" w:hAnsi="Arial" w:cs="Arial"/>
+          <w:bCs w:val="false"/>
+          <w:b w:val="false"/>
           <w:noProof/>
-          <w:sz w:val="24"/>
-          <w:szCs w:val="24"/>
+          <w:sz w:val="20"/>
+          <w:szCs w:val="20"/>
         </w:rPr>
         <w:t>{{validadeProp}}</w:t>
       </w:r>
       <w:r>
         <w:rPr>
           <w:rFonts w:ascii="Arial" w:hAnsi="Arial" w:cs="Arial"/>
-          <w:b/>
-          <w:bCs/>
-          <w:sz w:val="24"/>
-          <w:szCs w:val="24"/>
+          <w:b w:val="false"/>
+          <w:bCs w:val="false"/>
+          <w:sz w:val="20"/>
+          <w:szCs w:val="20"/>
         </w:rPr>
         <w:t xml:space="preserve"> </w:t>
       </w:r>
       <w:r>
         <w:rPr>
           <w:rFonts w:ascii="Arial" w:hAnsi="Arial" w:cs="Arial"/>
-          <w:sz w:val="24"/>
-          <w:szCs w:val="24"/>
+          <w:bCs w:val="false"/>
+          <w:b w:val="false"/>
+          <w:sz w:val="20"/>
+          <w:szCs w:val="20"/>
         </w:rPr>
         <w:t>dias após a emissão.</w:t>
       </w:r>
@@ -6194,8 +6308,8 @@
         <w:jc w:val="both"/>
         <w:rPr>
           <w:rFonts w:ascii="Arial" w:hAnsi="Arial" w:cs="Arial"/>
-          <w:sz w:val="24"/>
-          <w:szCs w:val="24"/>
+          <w:sz w:val="20"/>
+          <w:szCs w:val="20"/>
           <w:b w:val="true"/>
           <w:bCs w:val="true"/>
         </w:rPr>
@@ -6205,8 +6319,8 @@
         <w:rPr>
           <w:rFonts w:ascii="Arial" w:hAnsi="Arial" w:cs="Arial"/>
           <w:b w:val="true"/>
-          <w:sz w:val="24"/>
-          <w:szCs w:val="24"/>
+          <w:sz w:val="20"/>
+          <w:szCs w:val="20"/>
           <w:bCs w:val="true"/>
         </w:rPr>
         <w:t>- Observações:</w:t>
@@ -6227,47 +6341,59 @@
         <w:jc w:val="both"/>
         <w:rPr>
           <w:rFonts w:ascii="Arial" w:hAnsi="Arial" w:cs="Arial"/>
-          <w:sz w:val="24"/>
-          <w:szCs w:val="24"/>
-        </w:rPr>
-      </w:pPr>
-      <w:r>
-        <w:rPr>
-          <w:rFonts w:ascii="Arial" w:hAnsi="Arial" w:cs="Arial"/>
-          <w:sz w:val="24"/>
-          <w:szCs w:val="24"/>
+          <w:bCs w:val="false"/>
+          <w:b w:val="false"/>
+          <w:sz w:val="20"/>
+          <w:szCs w:val="20"/>
+        </w:rPr>
+      </w:pPr>
+      <w:r>
+        <w:rPr>
+          <w:rFonts w:ascii="Arial" w:hAnsi="Arial" w:cs="Arial"/>
+          <w:bCs w:val="false"/>
+          <w:b w:val="false"/>
+          <w:sz w:val="20"/>
+          <w:szCs w:val="20"/>
         </w:rPr>
         <w:t xml:space="preserve">No caso de prorrogação de prazo conforme item </w:t>
       </w:r>
       <w:r>
         <w:rPr>
           <w:rFonts w:ascii="Arial" w:hAnsi="Arial" w:cs="Arial"/>
-          <w:sz w:val="24"/>
-          <w:szCs w:val="24"/>
+          <w:bCs w:val="false"/>
+          <w:b w:val="false"/>
+          <w:sz w:val="20"/>
+          <w:szCs w:val="20"/>
         </w:rPr>
         <w:t>6</w:t>
       </w:r>
       <w:r>
         <w:rPr>
           <w:rFonts w:ascii="Arial" w:hAnsi="Arial" w:cs="Arial"/>
-          <w:sz w:val="24"/>
-          <w:szCs w:val="24"/>
+          <w:bCs w:val="false"/>
+          <w:b w:val="false"/>
+          <w:sz w:val="20"/>
+          <w:szCs w:val="20"/>
         </w:rPr>
         <w:t>.1</w:t>
       </w:r>
       <w:r>
         <w:rPr>
           <w:rFonts w:ascii="Arial" w:hAnsi="Arial" w:cs="Arial"/>
-          <w:sz w:val="24"/>
-          <w:szCs w:val="24"/>
+          <w:bCs w:val="false"/>
+          <w:b w:val="false"/>
+          <w:sz w:val="20"/>
+          <w:szCs w:val="20"/>
         </w:rPr>
         <w:t>.1</w:t>
       </w:r>
       <w:r>
         <w:rPr>
           <w:rFonts w:ascii="Arial" w:hAnsi="Arial" w:cs="Arial"/>
-          <w:sz w:val="24"/>
-          <w:szCs w:val="24"/>
+          <w:bCs w:val="false"/>
+          <w:b w:val="false"/>
+          <w:sz w:val="20"/>
+          <w:szCs w:val="20"/>
         </w:rPr>
         <w:t xml:space="preserve"> (dias trabalhados), descontinuidade dos serviços e ou caso nossa equipe de campo fique na obra aguardando frente de serviços por motivos não imputáveis a Filtrovali será relatado e indicado em RDO (no campo Stand-by - uma diária corresponde a - 08hrs);</w:t>
       </w:r>
@@ -6283,15 +6409,19 @@
         <w:jc w:val="both"/>
         <w:rPr>
           <w:rFonts w:ascii="Arial" w:hAnsi="Arial" w:cs="Arial"/>
-          <w:sz w:val="24"/>
-          <w:szCs w:val="24"/>
-        </w:rPr>
-      </w:pPr>
-      <w:r>
-        <w:rPr>
-          <w:rFonts w:ascii="Arial" w:hAnsi="Arial" w:cs="Arial"/>
-          <w:sz w:val="24"/>
-          <w:szCs w:val="24"/>
+          <w:bCs w:val="false"/>
+          <w:b w:val="false"/>
+          <w:sz w:val="20"/>
+          <w:szCs w:val="20"/>
+        </w:rPr>
+      </w:pPr>
+      <w:r>
+        <w:rPr>
+          <w:rFonts w:ascii="Arial" w:hAnsi="Arial" w:cs="Arial"/>
+          <w:bCs w:val="false"/>
+          <w:b w:val="false"/>
+          <w:sz w:val="20"/>
+          <w:szCs w:val="20"/>
         </w:rPr>
         <w:t>A proposta deverá fazer parte integrante do contrato;</w:t>
       </w:r>
@@ -6307,48 +6437,59 @@
         <w:jc w:val="both"/>
         <w:rPr>
           <w:rFonts w:ascii="Arial" w:hAnsi="Arial" w:cs="Arial"/>
-          <w:b/>
-          <w:sz w:val="24"/>
-          <w:szCs w:val="24"/>
-        </w:rPr>
-      </w:pPr>
-      <w:r>
-        <w:rPr>
-          <w:rFonts w:ascii="Arial" w:hAnsi="Arial" w:cs="Arial"/>
-          <w:sz w:val="24"/>
-          <w:szCs w:val="24"/>
+          <w:bCs w:val="false"/>
+          <w:b w:val="false"/>
+          <w:sz w:val="20"/>
+          <w:szCs w:val="20"/>
+        </w:rPr>
+      </w:pPr>
+      <w:r>
+        <w:rPr>
+          <w:rFonts w:ascii="Arial" w:hAnsi="Arial" w:cs="Arial"/>
+          <w:bCs w:val="false"/>
+          <w:b w:val="false"/>
+          <w:sz w:val="20"/>
+          <w:szCs w:val="20"/>
         </w:rPr>
         <w:t xml:space="preserve">Em casos de eventos de desmobilizações/mobilizações além do previsto, o solicitante terá que formalizar o pedido de desmobilização de equipe ou equipamento por e-mail expressando acordo com o item </w:t>
       </w:r>
       <w:r>
         <w:rPr>
           <w:rFonts w:ascii="Arial" w:hAnsi="Arial" w:cs="Arial"/>
-          <w:sz w:val="24"/>
-          <w:szCs w:val="24"/>
+          <w:bCs w:val="false"/>
+          <w:b w:val="false"/>
+          <w:sz w:val="20"/>
+          <w:szCs w:val="20"/>
         </w:rPr>
         <w:t>9</w:t>
       </w:r>
       <w:r>
         <w:rPr>
           <w:rFonts w:ascii="Arial" w:hAnsi="Arial" w:cs="Arial"/>
-          <w:sz w:val="24"/>
-          <w:szCs w:val="24"/>
+          <w:bCs w:val="false"/>
+          <w:b w:val="false"/>
+          <w:sz w:val="20"/>
+          <w:szCs w:val="20"/>
         </w:rPr>
         <w:t xml:space="preserve">.3 e/ou </w:t>
       </w:r>
       <w:r>
         <w:rPr>
           <w:rFonts w:ascii="Arial" w:hAnsi="Arial" w:cs="Arial"/>
-          <w:sz w:val="24"/>
-          <w:szCs w:val="24"/>
+          <w:bCs w:val="false"/>
+          <w:b w:val="false"/>
+          <w:sz w:val="20"/>
+          <w:szCs w:val="20"/>
         </w:rPr>
         <w:t>9</w:t>
       </w:r>
       <w:r>
         <w:rPr>
           <w:rFonts w:ascii="Arial" w:hAnsi="Arial" w:cs="Arial"/>
-          <w:sz w:val="24"/>
-          <w:szCs w:val="24"/>
+          <w:bCs w:val="false"/>
+          <w:b w:val="false"/>
+          <w:sz w:val="20"/>
+          <w:szCs w:val="20"/>
         </w:rPr>
         <w:t xml:space="preserve">.4 da proposta comercial. </w:t>
       </w:r>
@@ -6407,20 +6548,44 @@
         <w:pPr>
           <w:pStyle w:val="Rodap"/>
           <w:jc w:val="right"/>
+          <w:rPr>
+            <w:sz w:val="20"/>
+            <w:szCs w:val="20"/>
+          </w:rPr>
         </w:pPr>
         <w:r>
+          <w:rPr>
+            <w:sz w:val="20"/>
+            <w:szCs w:val="20"/>
+          </w:rPr>
           <w:fldChar w:fldCharType="begin"/>
         </w:r>
         <w:r>
+          <w:rPr>
+            <w:sz w:val="20"/>
+            <w:szCs w:val="20"/>
+          </w:rPr>
           <w:instrText>PAGE   \* MERGEFORMAT</w:instrText>
         </w:r>
         <w:r>
+          <w:rPr>
+            <w:sz w:val="20"/>
+            <w:szCs w:val="20"/>
+          </w:rPr>
           <w:fldChar w:fldCharType="separate"/>
         </w:r>
         <w:r>
+          <w:rPr>
+            <w:sz w:val="20"/>
+            <w:szCs w:val="20"/>
+          </w:rPr>
           <w:t>2</w:t>
         </w:r>
         <w:r>
+          <w:rPr>
+            <w:sz w:val="20"/>
+            <w:szCs w:val="20"/>
+          </w:rPr>
           <w:fldChar w:fldCharType="end"/>
         </w:r>
       </w:p>
@@ -6603,6 +6768,10 @@
       </w:pPr>
       <w:rPr>
         <w:rFonts w:hint="default"/>
+        <w:bCs w:val="true"/>
+        <w:b w:val="true"/>
+        <w:sz w:val="20"/>
+        <w:szCs w:val="20"/>
       </w:rPr>
     </w:lvl>
     <w:lvl w:ilvl="1" w:tplc="04160019" w:tentative="1">
@@ -6613,6 +6782,10 @@
       <w:pPr>
         <w:ind w:left="1440" w:hanging="360"/>
       </w:pPr>
+      <w:rPr>
+        <w:sz w:val="20"/>
+        <w:szCs w:val="20"/>
+      </w:rPr>
     </w:lvl>
     <w:lvl w:ilvl="2" w:tplc="0416001B" w:tentative="1">
       <w:start w:val="1"/>
@@ -6622,6 +6795,10 @@
       <w:pPr>
         <w:ind w:left="2160" w:hanging="180"/>
       </w:pPr>
+      <w:rPr>
+        <w:sz w:val="20"/>
+        <w:szCs w:val="20"/>
+      </w:rPr>
     </w:lvl>
     <w:lvl w:ilvl="3" w:tplc="0416000F" w:tentative="1">
       <w:start w:val="1"/>
@@ -6631,6 +6808,12 @@
       <w:pPr>
         <w:ind w:left="2880" w:hanging="360"/>
       </w:pPr>
+      <w:rPr>
+        <w:bCs w:val="true"/>
+        <w:b w:val="true"/>
+        <w:sz w:val="20"/>
+        <w:szCs w:val="20"/>
+      </w:rPr>
     </w:lvl>
     <w:lvl w:ilvl="4" w:tplc="04160019" w:tentative="1">
       <w:start w:val="1"/>
@@ -6640,6 +6823,10 @@
       <w:pPr>
         <w:ind w:left="3600" w:hanging="360"/>
       </w:pPr>
+      <w:rPr>
+        <w:sz w:val="20"/>
+        <w:szCs w:val="20"/>
+      </w:rPr>
     </w:lvl>
     <w:lvl w:ilvl="5" w:tplc="0416001B" w:tentative="1">
       <w:start w:val="1"/>
@@ -6649,6 +6836,10 @@
       <w:pPr>
         <w:ind w:left="4320" w:hanging="180"/>
       </w:pPr>
+      <w:rPr>
+        <w:sz w:val="20"/>
+        <w:szCs w:val="20"/>
+      </w:rPr>
     </w:lvl>
     <w:lvl w:ilvl="6" w:tplc="0416000F" w:tentative="1">
       <w:start w:val="1"/>
@@ -6658,6 +6849,12 @@
       <w:pPr>
         <w:ind w:left="5040" w:hanging="360"/>
       </w:pPr>
+      <w:rPr>
+        <w:bCs w:val="true"/>
+        <w:b w:val="true"/>
+        <w:sz w:val="20"/>
+        <w:szCs w:val="20"/>
+      </w:rPr>
     </w:lvl>
     <w:lvl w:ilvl="7" w:tplc="04160019" w:tentative="1">
       <w:start w:val="1"/>
@@ -6667,6 +6864,10 @@
       <w:pPr>
         <w:ind w:left="5760" w:hanging="360"/>
       </w:pPr>
+      <w:rPr>
+        <w:sz w:val="20"/>
+        <w:szCs w:val="20"/>
+      </w:rPr>
     </w:lvl>
     <w:lvl w:ilvl="8" w:tplc="0416001B" w:tentative="1">
       <w:start w:val="1"/>
@@ -6676,6 +6877,10 @@
       <w:pPr>
         <w:ind w:left="6480" w:hanging="180"/>
       </w:pPr>
+      <w:rPr>
+        <w:sz w:val="20"/>
+        <w:szCs w:val="20"/>
+      </w:rPr>
     </w:lvl>
   </w:abstractNum>
   <w:abstractNum w:abstractNumId="1" w15:restartNumberingAfterBreak="0">
@@ -6692,6 +6897,10 @@
       </w:pPr>
       <w:rPr>
         <w:rFonts w:hint="default"/>
+        <w:bCs w:val="true"/>
+        <w:b w:val="true"/>
+        <w:sz w:val="20"/>
+        <w:szCs w:val="20"/>
       </w:rPr>
     </w:lvl>
     <w:lvl w:ilvl="1" w:tplc="04160019" w:tentative="1">
@@ -6702,6 +6911,10 @@
       <w:pPr>
         <w:ind w:left="1440" w:hanging="360"/>
       </w:pPr>
+      <w:rPr>
+        <w:sz w:val="20"/>
+        <w:szCs w:val="20"/>
+      </w:rPr>
     </w:lvl>
     <w:lvl w:ilvl="2" w:tplc="0416001B" w:tentative="1">
       <w:start w:val="1"/>
@@ -6711,6 +6924,10 @@
       <w:pPr>
         <w:ind w:left="2160" w:hanging="180"/>
       </w:pPr>
+      <w:rPr>
+        <w:sz w:val="20"/>
+        <w:szCs w:val="20"/>
+      </w:rPr>
     </w:lvl>
     <w:lvl w:ilvl="3" w:tplc="0416000F" w:tentative="1">
       <w:start w:val="1"/>
@@ -6720,6 +6937,12 @@
       <w:pPr>
         <w:ind w:left="2880" w:hanging="360"/>
       </w:pPr>
+      <w:rPr>
+        <w:bCs w:val="true"/>
+        <w:b w:val="true"/>
+        <w:sz w:val="20"/>
+        <w:szCs w:val="20"/>
+      </w:rPr>
     </w:lvl>
     <w:lvl w:ilvl="4" w:tplc="04160019" w:tentative="1">
       <w:start w:val="1"/>
@@ -6729,6 +6952,10 @@
       <w:pPr>
         <w:ind w:left="3600" w:hanging="360"/>
       </w:pPr>
+      <w:rPr>
+        <w:sz w:val="20"/>
+        <w:szCs w:val="20"/>
+      </w:rPr>
     </w:lvl>
     <w:lvl w:ilvl="5" w:tplc="0416001B" w:tentative="1">
       <w:start w:val="1"/>
@@ -6738,6 +6965,10 @@
       <w:pPr>
         <w:ind w:left="4320" w:hanging="180"/>
       </w:pPr>
+      <w:rPr>
+        <w:sz w:val="20"/>
+        <w:szCs w:val="20"/>
+      </w:rPr>
     </w:lvl>
     <w:lvl w:ilvl="6" w:tplc="0416000F" w:tentative="1">
       <w:start w:val="1"/>
@@ -6747,6 +6978,12 @@
       <w:pPr>
         <w:ind w:left="5040" w:hanging="360"/>
       </w:pPr>
+      <w:rPr>
+        <w:bCs w:val="true"/>
+        <w:b w:val="true"/>
+        <w:sz w:val="20"/>
+        <w:szCs w:val="20"/>
+      </w:rPr>
     </w:lvl>
     <w:lvl w:ilvl="7" w:tplc="04160019" w:tentative="1">
       <w:start w:val="1"/>
@@ -6756,6 +6993,10 @@
       <w:pPr>
         <w:ind w:left="5760" w:hanging="360"/>
       </w:pPr>
+      <w:rPr>
+        <w:sz w:val="20"/>
+        <w:szCs w:val="20"/>
+      </w:rPr>
     </w:lvl>
     <w:lvl w:ilvl="8" w:tplc="0416001B" w:tentative="1">
       <w:start w:val="1"/>
@@ -6765,6 +7006,10 @@
       <w:pPr>
         <w:ind w:left="6480" w:hanging="180"/>
       </w:pPr>
+      <w:rPr>
+        <w:sz w:val="20"/>
+        <w:szCs w:val="20"/>
+      </w:rPr>
     </w:lvl>
   </w:abstractNum>
   <w:abstractNum w:abstractNumId="2" w15:restartNumberingAfterBreak="0">
@@ -6781,6 +7026,10 @@
       </w:pPr>
       <w:rPr>
         <w:rFonts w:hint="default"/>
+        <w:bCs w:val="true"/>
+        <w:b w:val="true"/>
+        <w:sz w:val="20"/>
+        <w:szCs w:val="20"/>
       </w:rPr>
     </w:lvl>
     <w:lvl w:ilvl="1">
@@ -6794,6 +7043,10 @@
       </w:pPr>
       <w:rPr>
         <w:rFonts w:hint="default"/>
+        <w:bCs w:val="true"/>
+        <w:b w:val="true"/>
+        <w:sz w:val="20"/>
+        <w:szCs w:val="20"/>
       </w:rPr>
     </w:lvl>
     <w:lvl w:ilvl="2">
@@ -6807,6 +7060,10 @@
       </w:pPr>
       <w:rPr>
         <w:rFonts w:hint="default"/>
+        <w:bCs w:val="true"/>
+        <w:b w:val="true"/>
+        <w:sz w:val="20"/>
+        <w:szCs w:val="20"/>
       </w:rPr>
     </w:lvl>
     <w:lvl w:ilvl="3">
@@ -6820,6 +7077,10 @@
       </w:pPr>
       <w:rPr>
         <w:rFonts w:hint="default"/>
+        <w:bCs w:val="true"/>
+        <w:b w:val="true"/>
+        <w:sz w:val="20"/>
+        <w:szCs w:val="20"/>
       </w:rPr>
     </w:lvl>
     <w:lvl w:ilvl="4">
@@ -6833,6 +7094,10 @@
       </w:pPr>
       <w:rPr>
         <w:rFonts w:hint="default"/>
+        <w:bCs w:val="true"/>
+        <w:b w:val="true"/>
+        <w:sz w:val="20"/>
+        <w:szCs w:val="20"/>
       </w:rPr>
     </w:lvl>
     <w:lvl w:ilvl="5">
@@ -6846,6 +7111,10 @@
       </w:pPr>
       <w:rPr>
         <w:rFonts w:hint="default"/>
+        <w:bCs w:val="true"/>
+        <w:b w:val="true"/>
+        <w:sz w:val="20"/>
+        <w:szCs w:val="20"/>
       </w:rPr>
     </w:lvl>
     <w:lvl w:ilvl="6">
@@ -6859,6 +7128,10 @@
       </w:pPr>
       <w:rPr>
         <w:rFonts w:hint="default"/>
+        <w:bCs w:val="true"/>
+        <w:b w:val="true"/>
+        <w:sz w:val="20"/>
+        <w:szCs w:val="20"/>
       </w:rPr>
     </w:lvl>
     <w:lvl w:ilvl="7">
@@ -6872,6 +7145,10 @@
       </w:pPr>
       <w:rPr>
         <w:rFonts w:hint="default"/>
+        <w:bCs w:val="true"/>
+        <w:b w:val="true"/>
+        <w:sz w:val="20"/>
+        <w:szCs w:val="20"/>
       </w:rPr>
     </w:lvl>
     <w:lvl w:ilvl="8">
@@ -6885,6 +7162,10 @@
       </w:pPr>
       <w:rPr>
         <w:rFonts w:hint="default"/>
+        <w:bCs w:val="true"/>
+        <w:b w:val="true"/>
+        <w:sz w:val="20"/>
+        <w:szCs w:val="20"/>
       </w:rPr>
     </w:lvl>
   </w:abstractNum>
@@ -6902,6 +7183,10 @@
       </w:pPr>
       <w:rPr>
         <w:rFonts w:hint="default"/>
+        <w:bCs w:val="true"/>
+        <w:b w:val="true"/>
+        <w:sz w:val="20"/>
+        <w:szCs w:val="20"/>
       </w:rPr>
     </w:lvl>
     <w:lvl w:ilvl="1" w:tplc="04160019" w:tentative="1">
@@ -6912,6 +7197,10 @@
       <w:pPr>
         <w:ind w:left="1440" w:hanging="360"/>
       </w:pPr>
+      <w:rPr>
+        <w:sz w:val="20"/>
+        <w:szCs w:val="20"/>
+      </w:rPr>
     </w:lvl>
     <w:lvl w:ilvl="2" w:tplc="0416001B" w:tentative="1">
       <w:start w:val="1"/>
@@ -6921,6 +7210,10 @@
       <w:pPr>
         <w:ind w:left="2160" w:hanging="180"/>
       </w:pPr>
+      <w:rPr>
+        <w:sz w:val="20"/>
+        <w:szCs w:val="20"/>
+      </w:rPr>
     </w:lvl>
     <w:lvl w:ilvl="3" w:tplc="0416000F" w:tentative="1">
       <w:start w:val="1"/>
@@ -6930,6 +7223,12 @@
       <w:pPr>
         <w:ind w:left="2880" w:hanging="360"/>
       </w:pPr>
+      <w:rPr>
+        <w:bCs w:val="true"/>
+        <w:b w:val="true"/>
+        <w:sz w:val="20"/>
+        <w:szCs w:val="20"/>
+      </w:rPr>
     </w:lvl>
     <w:lvl w:ilvl="4" w:tplc="04160019" w:tentative="1">
       <w:start w:val="1"/>
@@ -6939,6 +7238,10 @@
       <w:pPr>
         <w:ind w:left="3600" w:hanging="360"/>
       </w:pPr>
+      <w:rPr>
+        <w:sz w:val="20"/>
+        <w:szCs w:val="20"/>
+      </w:rPr>
     </w:lvl>
     <w:lvl w:ilvl="5" w:tplc="0416001B" w:tentative="1">
       <w:start w:val="1"/>
@@ -6948,6 +7251,10 @@
       <w:pPr>
         <w:ind w:left="4320" w:hanging="180"/>
       </w:pPr>
+      <w:rPr>
+        <w:sz w:val="20"/>
+        <w:szCs w:val="20"/>
+      </w:rPr>
     </w:lvl>
     <w:lvl w:ilvl="6" w:tplc="0416000F" w:tentative="1">
       <w:start w:val="1"/>
@@ -6957,6 +7264,12 @@
       <w:pPr>
         <w:ind w:left="5040" w:hanging="360"/>
       </w:pPr>
+      <w:rPr>
+        <w:bCs w:val="true"/>
+        <w:b w:val="true"/>
+        <w:sz w:val="20"/>
+        <w:szCs w:val="20"/>
+      </w:rPr>
     </w:lvl>
     <w:lvl w:ilvl="7" w:tplc="04160019" w:tentative="1">
       <w:start w:val="1"/>
@@ -6966,6 +7279,10 @@
       <w:pPr>
         <w:ind w:left="5760" w:hanging="360"/>
       </w:pPr>
+      <w:rPr>
+        <w:sz w:val="20"/>
+        <w:szCs w:val="20"/>
+      </w:rPr>
     </w:lvl>
     <w:lvl w:ilvl="8" w:tplc="0416001B" w:tentative="1">
       <w:start w:val="1"/>
@@ -6975,6 +7292,10 @@
       <w:pPr>
         <w:ind w:left="6480" w:hanging="180"/>
       </w:pPr>
+      <w:rPr>
+        <w:sz w:val="20"/>
+        <w:szCs w:val="20"/>
+      </w:rPr>
     </w:lvl>
   </w:abstractNum>
   <w:abstractNum w:abstractNumId="4" w15:restartNumberingAfterBreak="0">
@@ -6991,6 +7312,8 @@
       </w:pPr>
       <w:rPr>
         <w:rFonts w:ascii="Courier New" w:hAnsi="Courier New" w:cs="Courier New" w:hint="default"/>
+        <w:sz w:val="20"/>
+        <w:szCs w:val="20"/>
       </w:rPr>
     </w:lvl>
     <w:lvl w:ilvl="1" w:tplc="04160003">
@@ -7003,6 +7326,8 @@
       </w:pPr>
       <w:rPr>
         <w:rFonts w:ascii="Courier New" w:hAnsi="Courier New" w:cs="Courier New" w:hint="default"/>
+        <w:sz w:val="20"/>
+        <w:szCs w:val="20"/>
       </w:rPr>
     </w:lvl>
     <w:lvl w:ilvl="2" w:tplc="04160005" w:tentative="1">
@@ -7015,6 +7340,8 @@
       </w:pPr>
       <w:rPr>
         <w:rFonts w:ascii="Wingdings" w:hAnsi="Wingdings" w:hint="default"/>
+        <w:sz w:val="20"/>
+        <w:szCs w:val="20"/>
       </w:rPr>
     </w:lvl>
     <w:lvl w:ilvl="3" w:tplc="04160001" w:tentative="1">
@@ -7027,6 +7354,8 @@
       </w:pPr>
       <w:rPr>
         <w:rFonts w:ascii="Symbol" w:hAnsi="Symbol" w:hint="default"/>
+        <w:sz w:val="20"/>
+        <w:szCs w:val="20"/>
       </w:rPr>
     </w:lvl>
     <w:lvl w:ilvl="4" w:tplc="04160003" w:tentative="1">
@@ -7039,6 +7368,8 @@
       </w:pPr>
       <w:rPr>
         <w:rFonts w:ascii="Courier New" w:hAnsi="Courier New" w:cs="Courier New" w:hint="default"/>
+        <w:sz w:val="20"/>
+        <w:szCs w:val="20"/>
       </w:rPr>
     </w:lvl>
     <w:lvl w:ilvl="5" w:tplc="04160005" w:tentative="1">
@@ -7051,6 +7382,8 @@
       </w:pPr>
       <w:rPr>
         <w:rFonts w:ascii="Wingdings" w:hAnsi="Wingdings" w:hint="default"/>
+        <w:sz w:val="20"/>
+        <w:szCs w:val="20"/>
       </w:rPr>
     </w:lvl>
     <w:lvl w:ilvl="6" w:tplc="04160001" w:tentative="1">
@@ -7063,6 +7396,8 @@
       </w:pPr>
       <w:rPr>
         <w:rFonts w:ascii="Symbol" w:hAnsi="Symbol" w:hint="default"/>
+        <w:sz w:val="20"/>
+        <w:szCs w:val="20"/>
       </w:rPr>
     </w:lvl>
     <w:lvl w:ilvl="7" w:tplc="04160003" w:tentative="1">
@@ -7075,6 +7410,8 @@
       </w:pPr>
       <w:rPr>
         <w:rFonts w:ascii="Courier New" w:hAnsi="Courier New" w:cs="Courier New" w:hint="default"/>
+        <w:sz w:val="20"/>
+        <w:szCs w:val="20"/>
       </w:rPr>
     </w:lvl>
     <w:lvl w:ilvl="8" w:tplc="04160005" w:tentative="1">
@@ -7087,6 +7424,8 @@
       </w:pPr>
       <w:rPr>
         <w:rFonts w:ascii="Wingdings" w:hAnsi="Wingdings" w:hint="default"/>
+        <w:sz w:val="20"/>
+        <w:szCs w:val="20"/>
       </w:rPr>
     </w:lvl>
   </w:abstractNum>
@@ -7104,6 +7443,8 @@
       </w:pPr>
       <w:rPr>
         <w:rFonts w:ascii="Courier New" w:hAnsi="Courier New" w:hint="default"/>
+        <w:sz w:val="20"/>
+        <w:szCs w:val="20"/>
       </w:rPr>
     </w:lvl>
     <w:lvl w:ilvl="1" w:tplc="04160003">
@@ -7116,6 +7457,8 @@
       </w:pPr>
       <w:rPr>
         <w:rFonts w:ascii="Courier New" w:hAnsi="Courier New" w:cs="Courier New" w:hint="default"/>
+        <w:sz w:val="20"/>
+        <w:szCs w:val="20"/>
       </w:rPr>
     </w:lvl>
     <w:lvl w:ilvl="2" w:tplc="04160005" w:tentative="1">
@@ -7128,6 +7471,8 @@
       </w:pPr>
       <w:rPr>
         <w:rFonts w:ascii="Wingdings" w:hAnsi="Wingdings" w:hint="default"/>
+        <w:sz w:val="20"/>
+        <w:szCs w:val="20"/>
       </w:rPr>
     </w:lvl>
     <w:lvl w:ilvl="3" w:tplc="04160001" w:tentative="1">
@@ -7140,6 +7485,8 @@
       </w:pPr>
       <w:rPr>
         <w:rFonts w:ascii="Symbol" w:hAnsi="Symbol" w:hint="default"/>
+        <w:sz w:val="20"/>
+        <w:szCs w:val="20"/>
       </w:rPr>
     </w:lvl>
     <w:lvl w:ilvl="4" w:tplc="04160003" w:tentative="1">
@@ -7152,6 +7499,8 @@
       </w:pPr>
       <w:rPr>
         <w:rFonts w:ascii="Courier New" w:hAnsi="Courier New" w:cs="Courier New" w:hint="default"/>
+        <w:sz w:val="20"/>
+        <w:szCs w:val="20"/>
       </w:rPr>
     </w:lvl>
     <w:lvl w:ilvl="5" w:tplc="04160005" w:tentative="1">
@@ -7164,6 +7513,8 @@
       </w:pPr>
       <w:rPr>
         <w:rFonts w:ascii="Wingdings" w:hAnsi="Wingdings" w:hint="default"/>
+        <w:sz w:val="20"/>
+        <w:szCs w:val="20"/>
       </w:rPr>
     </w:lvl>
     <w:lvl w:ilvl="6" w:tplc="04160001" w:tentative="1">
@@ -7176,6 +7527,8 @@
       </w:pPr>
       <w:rPr>
         <w:rFonts w:ascii="Symbol" w:hAnsi="Symbol" w:hint="default"/>
+        <w:sz w:val="20"/>
+        <w:szCs w:val="20"/>
       </w:rPr>
     </w:lvl>
     <w:lvl w:ilvl="7" w:tplc="04160003" w:tentative="1">
@@ -7188,6 +7541,8 @@
       </w:pPr>
       <w:rPr>
         <w:rFonts w:ascii="Courier New" w:hAnsi="Courier New" w:cs="Courier New" w:hint="default"/>
+        <w:sz w:val="20"/>
+        <w:szCs w:val="20"/>
       </w:rPr>
     </w:lvl>
     <w:lvl w:ilvl="8" w:tplc="04160005" w:tentative="1">
@@ -7200,6 +7555,8 @@
       </w:pPr>
       <w:rPr>
         <w:rFonts w:ascii="Wingdings" w:hAnsi="Wingdings" w:hint="default"/>
+        <w:sz w:val="20"/>
+        <w:szCs w:val="20"/>
       </w:rPr>
     </w:lvl>
   </w:abstractNum>
@@ -7220,8 +7577,10 @@
         <w:ind w:left="360" w:hanging="360"/>
       </w:pPr>
       <w:rPr>
-        <w:b/>
-        <w:bCs/>
+        <w:b w:val="true"/>
+        <w:bCs w:val="true"/>
+        <w:sz w:val="20"/>
+        <w:szCs w:val="20"/>
       </w:rPr>
     </w:lvl>
     <w:lvl w:ilvl="1">
@@ -7237,8 +7596,10 @@
         <w:ind w:left="1068" w:hanging="360"/>
       </w:pPr>
       <w:rPr>
-        <w:b/>
-        <w:bCs/>
+        <w:b w:val="true"/>
+        <w:bCs w:val="true"/>
+        <w:sz w:val="20"/>
+        <w:szCs w:val="20"/>
       </w:rPr>
     </w:lvl>
     <w:lvl w:ilvl="2">
@@ -7253,6 +7614,12 @@
         </w:tabs>
         <w:ind w:left="2136" w:hanging="720"/>
       </w:pPr>
+      <w:rPr>
+        <w:bCs w:val="true"/>
+        <w:b w:val="true"/>
+        <w:sz w:val="20"/>
+        <w:szCs w:val="20"/>
+      </w:rPr>
     </w:lvl>
     <w:lvl w:ilvl="3">
       <w:start w:val="1"/>
@@ -7265,6 +7632,12 @@
         </w:tabs>
         <w:ind w:left="2844" w:hanging="720"/>
       </w:pPr>
+      <w:rPr>
+        <w:bCs w:val="true"/>
+        <w:b w:val="true"/>
+        <w:sz w:val="20"/>
+        <w:szCs w:val="20"/>
+      </w:rPr>
     </w:lvl>
     <w:lvl w:ilvl="4">
       <w:start w:val="1"/>
@@ -7277,6 +7650,12 @@
         </w:tabs>
         <w:ind w:left="3912" w:hanging="1080"/>
       </w:pPr>
+      <w:rPr>
+        <w:bCs w:val="true"/>
+        <w:b w:val="true"/>
+        <w:sz w:val="20"/>
+        <w:szCs w:val="20"/>
+      </w:rPr>
     </w:lvl>
     <w:lvl w:ilvl="5">
       <w:start w:val="1"/>
@@ -7289,6 +7668,12 @@
         </w:tabs>
         <w:ind w:left="4620" w:hanging="1080"/>
       </w:pPr>
+      <w:rPr>
+        <w:bCs w:val="true"/>
+        <w:b w:val="true"/>
+        <w:sz w:val="20"/>
+        <w:szCs w:val="20"/>
+      </w:rPr>
     </w:lvl>
     <w:lvl w:ilvl="6">
       <w:start w:val="1"/>
@@ -7301,6 +7686,12 @@
         </w:tabs>
         <w:ind w:left="5688" w:hanging="1440"/>
       </w:pPr>
+      <w:rPr>
+        <w:bCs w:val="true"/>
+        <w:b w:val="true"/>
+        <w:sz w:val="20"/>
+        <w:szCs w:val="20"/>
+      </w:rPr>
     </w:lvl>
     <w:lvl w:ilvl="7">
       <w:start w:val="1"/>
@@ -7313,6 +7704,12 @@
         </w:tabs>
         <w:ind w:left="6396" w:hanging="1440"/>
       </w:pPr>
+      <w:rPr>
+        <w:bCs w:val="true"/>
+        <w:b w:val="true"/>
+        <w:sz w:val="20"/>
+        <w:szCs w:val="20"/>
+      </w:rPr>
     </w:lvl>
     <w:lvl w:ilvl="8">
       <w:start w:val="1"/>
@@ -7325,6 +7722,12 @@
         </w:tabs>
         <w:ind w:left="7464" w:hanging="1800"/>
       </w:pPr>
+      <w:rPr>
+        <w:bCs w:val="true"/>
+        <w:b w:val="true"/>
+        <w:sz w:val="20"/>
+        <w:szCs w:val="20"/>
+      </w:rPr>
     </w:lvl>
   </w:abstractNum>
   <w:abstractNum w:abstractNumId="7" w15:restartNumberingAfterBreak="0">
@@ -7341,6 +7744,8 @@
       </w:pPr>
       <w:rPr>
         <w:rFonts w:ascii="Symbol" w:hAnsi="Symbol" w:hint="default"/>
+        <w:sz w:val="20"/>
+        <w:szCs w:val="20"/>
       </w:rPr>
     </w:lvl>
     <w:lvl w:ilvl="1" w:tplc="04160003" w:tentative="1">
@@ -7353,6 +7758,8 @@
       </w:pPr>
       <w:rPr>
         <w:rFonts w:ascii="Courier New" w:hAnsi="Courier New" w:cs="Courier New" w:hint="default"/>
+        <w:sz w:val="20"/>
+        <w:szCs w:val="20"/>
       </w:rPr>
     </w:lvl>
     <w:lvl w:ilvl="2" w:tplc="04160005" w:tentative="1">
@@ -7365,6 +7772,8 @@
       </w:pPr>
       <w:rPr>
         <w:rFonts w:ascii="Wingdings" w:hAnsi="Wingdings" w:hint="default"/>
+        <w:sz w:val="20"/>
+        <w:szCs w:val="20"/>
       </w:rPr>
     </w:lvl>
     <w:lvl w:ilvl="3" w:tplc="04160001" w:tentative="1">
@@ -7377,6 +7786,8 @@
       </w:pPr>
       <w:rPr>
         <w:rFonts w:ascii="Symbol" w:hAnsi="Symbol" w:hint="default"/>
+        <w:sz w:val="20"/>
+        <w:szCs w:val="20"/>
       </w:rPr>
     </w:lvl>
     <w:lvl w:ilvl="4" w:tplc="04160003" w:tentative="1">
@@ -7389,6 +7800,8 @@
       </w:pPr>
       <w:rPr>
         <w:rFonts w:ascii="Courier New" w:hAnsi="Courier New" w:cs="Courier New" w:hint="default"/>
+        <w:sz w:val="20"/>
+        <w:szCs w:val="20"/>
       </w:rPr>
     </w:lvl>
     <w:lvl w:ilvl="5" w:tplc="04160005" w:tentative="1">
@@ -7401,6 +7814,8 @@
       </w:pPr>
       <w:rPr>
         <w:rFonts w:ascii="Wingdings" w:hAnsi="Wingdings" w:hint="default"/>
+        <w:sz w:val="20"/>
+        <w:szCs w:val="20"/>
       </w:rPr>
     </w:lvl>
     <w:lvl w:ilvl="6" w:tplc="04160001" w:tentative="1">
@@ -7413,6 +7828,8 @@
       </w:pPr>
       <w:rPr>
         <w:rFonts w:ascii="Symbol" w:hAnsi="Symbol" w:hint="default"/>
+        <w:sz w:val="20"/>
+        <w:szCs w:val="20"/>
       </w:rPr>
     </w:lvl>
     <w:lvl w:ilvl="7" w:tplc="04160003" w:tentative="1">
@@ -7425,6 +7842,8 @@
       </w:pPr>
       <w:rPr>
         <w:rFonts w:ascii="Courier New" w:hAnsi="Courier New" w:cs="Courier New" w:hint="default"/>
+        <w:sz w:val="20"/>
+        <w:szCs w:val="20"/>
       </w:rPr>
     </w:lvl>
     <w:lvl w:ilvl="8" w:tplc="04160005" w:tentative="1">
@@ -7437,6 +7856,8 @@
       </w:pPr>
       <w:rPr>
         <w:rFonts w:ascii="Wingdings" w:hAnsi="Wingdings" w:hint="default"/>
+        <w:sz w:val="20"/>
+        <w:szCs w:val="20"/>
       </w:rPr>
     </w:lvl>
   </w:abstractNum>
@@ -7977,6 +8398,10 @@
       </w:tabs>
       <w:spacing w:after="0" w:line="240" w:lineRule="auto"/>
     </w:pPr>
+    <w:rPr>
+      <w:sz w:val="20"/>
+      <w:szCs w:val="20"/>
+    </w:rPr>
   </w:style>
   <w:style w:type="character" w:customStyle="1" w:styleId="RodapChar">
     <w:name w:val="Rodapé Char"/>
@@ -7984,6 +8409,10 @@
     <w:link w:val="Rodap"/>
     <w:uiPriority w:val="99"/>
     <w:rsid w:val="00FB5352"/>
+    <w:rPr>
+      <w:sz w:val="20"/>
+      <w:szCs w:val="20"/>
+    </w:rPr>
   </w:style>
   <w:style w:type="character" w:styleId="Hyperlink">
     <w:name w:val="Hyperlink"/>
@@ -8048,8 +8477,8 @@
       <w:rFonts w:ascii="Arial" w:hAnsi="Arial" w:cs="Arial"/>
       <w:b/>
       <w:color w:val="000000" w:themeColor="text1"/>
-      <w:sz w:val="24"/>
-      <w:szCs w:val="32"/>
+      <w:sz w:val="20"/>
+      <w:szCs w:val="20"/>
     </w:rPr>
   </w:style>
   <w:style w:type="paragraph" w:styleId="Ttulo2">
@@ -8073,10 +8502,11 @@
     </w:pPr>
     <w:rPr>
       <w:rFonts w:ascii="Arial" w:hAnsi="Arial" w:cs="Arial"/>
-      <w:b/>
+      <w:bCs w:val="0"/>
+      <w:b w:val="0"/>
       <w:color w:val="000000" w:themeColor="text1"/>
-      <w:sz w:val="24"/>
-      <w:szCs w:val="26"/>
+      <w:sz w:val="20"/>
+      <w:szCs w:val="20"/>
     </w:rPr>
   </w:style>
   <w:style w:type="paragraph" w:styleId="Ttulo3">
@@ -8099,10 +8529,11 @@
     </w:pPr>
     <w:rPr>
       <w:rFonts w:ascii="Arial" w:hAnsi="Arial" w:cs="Arial"/>
-      <w:b/>
+      <w:bCs w:val="0"/>
+      <w:b w:val="0"/>
       <w:color w:val="000000" w:themeColor="text1"/>
-      <w:sz w:val="24"/>
-      <w:szCs w:val="26"/>
+      <w:sz w:val="20"/>
+      <w:szCs w:val="20"/>
     </w:rPr>
   </w:style>
   <w:style w:type="character" w:customStyle="1" w:styleId="Ttulo1Char">
@@ -8115,8 +8546,8 @@
       <w:rFonts w:asciiTheme="majorHAnsi" w:eastAsiaTheme="majorEastAsia" w:hAnsiTheme="majorHAnsi" w:cstheme="majorBidi"/>
       <w:b/>
       <w:color w:val="000000" w:themeColor="text1"/>
-      <w:sz w:val="24"/>
-      <w:szCs w:val="32"/>
+      <w:sz w:val="20"/>
+      <w:szCs w:val="20"/>
     </w:rPr>
   </w:style>
   <w:style w:type="character" w:customStyle="1" w:styleId="Ttulo2Char">
@@ -8127,10 +8558,11 @@
     <w:rsid w:val="00E3098F"/>
     <w:rPr>
       <w:rFonts w:asciiTheme="majorHAnsi" w:eastAsiaTheme="majorEastAsia" w:hAnsiTheme="majorHAnsi" w:cstheme="majorBidi"/>
-      <w:b/>
+      <w:bCs w:val="0"/>
+      <w:b w:val="0"/>
       <w:color w:val="000000" w:themeColor="text1"/>
-      <w:sz w:val="24"/>
-      <w:szCs w:val="26"/>
+      <w:sz w:val="20"/>
+      <w:szCs w:val="20"/>
     </w:rPr>
   </w:style>
   <w:style w:type="paragraph" w:styleId="Sumrio1">

</xml_diff>